<commit_message>
docs(perf): record the second production re-check (one workspace request)
Update the notebook and the before/after report with the production results
after 1b1eb67: server render 2015 -> 871 ms median, hard page load
2439 -> 1604 ms median, Refresh data 2074 -> 1257 ms, tab clicks unchanged.
PERF-02 is now largely done; the real-backend comparison with a simulated
round trip is included; limits and what was not verified are stated.
</commit_message>
<xml_diff>
--- a/docs/SynthGraph-Performance-Before-After-Report-Production.docx
+++ b/docs/SynthGraph-Performance-Before-After-Report-Production.docx
@@ -45,7 +45,7 @@
           <w:sz w:val="21"/>
           <w:szCs w:val="21"/>
         </w:rPr>
-        <w:t xml:space="preserve">Observed on production, fixed in commit 379c83c (branch perf/workspace-tab-navigation), then re-measured on production after the deploy, with the same script. A local mock-backend comparison is included for the failure cases that should not be provoked on the live site.</w:t>
+        <w:t xml:space="preserve">Observed on production, fixed in two deploys (379c83c: tab clicks and rate limiting; 1b1eb67: one workspace request), and re-measured on production after each with the same script. Local comparisons cover the failure cases that should not be provoked on the live site.</w:t>
       </w:r>
     </w:p>
     <w:tbl>
@@ -136,7 +136,7 @@
                 <w:sz w:val="20"/>
                 <w:szCs w:val="20"/>
               </w:rPr>
-              <w:t xml:space="preserve">Not fixed: a full page load still takes about 2.0 s on production, because the three sequential backend hops are unchanged. Refresh data pays that cost on demand instead of every click.</w:t>
+              <w:t xml:space="preserve">After the first deploy a full page load was still about 2.0 s, because the three sequential backend hops were unchanged. The second deploy loads the whole workspace in one backend request: the server render fell from 2015 ms to a median of 871 ms, and Refresh data from 2.1 s to 1.3 s. A hard page load is about 1.6 s (median of three, range 1.1-2.0 s).</w:t>
             </w:r>
           </w:p>
           <w:p>
@@ -213,7 +213,7 @@
           <w:sz w:val="21"/>
           <w:szCs w:val="21"/>
         </w:rPr>
-        <w:t xml:space="preserve">Implemented the fixes on a new branch from origin/main and committed them (379c83c). You merged and deployed it.</w:t>
+        <w:t xml:space="preserve">Implemented the fixes on a new branch from origin/main and committed them (379c83c). You merged and deployed it. After the first production re-check the full page load was still about 2 s, so I added a second change (1b1eb67: batched health and drift, one workspace endpoint, timing), which you also merged and deployed.</w:t>
       </w:r>
     </w:p>
     <w:p>
@@ -310,6 +310,20 @@
                 <w:szCs w:val="20"/>
               </w:rPr>
               <w:t xml:space="preserve">Not exercised on production: the rate-limit failure path (nothing got throttled) and the per-user throttle (provoking it would stress the live site). Both were verified locally only.</w:t>
+            </w:r>
+          </w:p>
+          <w:p>
+            <w:pPr>
+              <w:spacing w:after="40"/>
+            </w:pPr>
+            <w:r>
+              <w:rPr>
+                <w:rFonts w:ascii="Calibri" w:cs="Calibri" w:eastAsia="Calibri" w:hAnsi="Calibri"/>
+                <w:color w:val="1F2937"/>
+                <w:sz w:val="20"/>
+                <w:szCs w:val="20"/>
+              </w:rPr>
+              <w:t xml:space="preserve">The second change was also measured on a real backend and database with a proxy adding a 150 ms round trip (section 6). That shows the effect of round trips and call counts, not production milliseconds.</w:t>
             </w:r>
           </w:p>
         </w:tc>
@@ -4303,7 +4317,7 @@
           <w:sz w:val="32"/>
           <w:szCs w:val="32"/>
         </w:rPr>
-        <w:t xml:space="preserve">5. After: production, same script as section 2</w:t>
+        <w:t xml:space="preserve">5. After the first deploy: production, same script as section 2</w:t>
       </w:r>
     </w:p>
     <w:p>
@@ -6669,7 +6683,7 @@
                 <w:sz w:val="20"/>
                 <w:szCs w:val="20"/>
               </w:rPr>
-              <w:t xml:space="preserve">Page load: unchanged at about 2 s. Calls fell from 33 to 18, but the hops did not, so the wait did not shrink. That is the next change (section 6), not a regression: it is the same cost as before, now paid once per visit instead of once per click.</w:t>
+              <w:t xml:space="preserve">Page load: unchanged at about 2 s. Calls fell from 33 to 18, but the hops did not, so the wait did not shrink. That is what the second change (sections 6 and 7) addresses.</w:t>
             </w:r>
           </w:p>
         </w:tc>
@@ -6689,7 +6703,1666 @@
           <w:sz w:val="32"/>
           <w:szCs w:val="32"/>
         </w:rPr>
-        <w:t xml:space="preserve">6. Limits and what is not done</w:t>
+        <w:t xml:space="preserve">6. The second change: one workspace request</w:t>
+      </w:r>
+    </w:p>
+    <w:p>
+      <w:pPr>
+        <w:spacing w:after="110" w:line="276"/>
+      </w:pPr>
+      <w:r>
+        <w:rPr>
+          <w:rFonts w:ascii="Calibri" w:cs="Calibri" w:eastAsia="Calibri" w:hAnsi="Calibri"/>
+          <w:color w:val="1F2937"/>
+          <w:sz w:val="21"/>
+          <w:szCs w:val="21"/>
+        </w:rPr>
+        <w:t xml:space="preserve">The full page load needed three dependent rounds of backend calls: the session check, then the lists, then the per-run and per-generation data. Fewer calls in the same three rounds did not help, so the change removes a round instead. Three additive backend routes, each built from the services behind the routes it replaces: health and drift for every run of an experiment in one call, and GET /experiments/:id/workspace, which returns the experiment, correlation report, runs (with metrics, evaluations, health and drift) and generations with their manifests in one response. The frontend uses it and falls back to the separate routes on an older backend. The workspace route also sends a Server-Timing header with the duration of each part, and the page logs it.</w:t>
+      </w:r>
+    </w:p>
+    <w:p>
+      <w:pPr>
+        <w:pStyle w:val="Heading2"/>
+        <w:keepNext/>
+        <w:spacing w:after="100" w:before="240"/>
+      </w:pPr>
+      <w:r>
+        <w:rPr>
+          <w:rFonts w:ascii="Calibri" w:cs="Calibri" w:eastAsia="Calibri" w:hAnsi="Calibri"/>
+          <w:b/>
+          <w:bCs/>
+          <w:color w:val="1D4ED8"/>
+          <w:sz w:val="26"/>
+          <w:szCs w:val="26"/>
+        </w:rPr>
+        <w:t xml:space="preserve">Measured on a real backend and database</w:t>
+      </w:r>
+    </w:p>
+    <w:p>
+      <w:pPr>
+        <w:spacing w:after="110" w:line="276"/>
+      </w:pPr>
+      <w:r>
+        <w:rPr>
+          <w:rFonts w:ascii="Calibri" w:cs="Calibri" w:eastAsia="Calibri" w:hAnsi="Calibri"/>
+          <w:color w:val="1F2937"/>
+          <w:sz w:val="21"/>
+          <w:szCs w:val="21"/>
+        </w:rPr>
+        <w:t xml:space="preserve">Real backend, real Postgres, a production Next build, seeded like the Phase 1 experiment, with a proxy adding 150 ms of round trip between the two. "Today's production" hides the new routes, which is what the previously deployed backend does. The local database answers in milliseconds, so this shows round-trip effects, not production milliseconds.</w:t>
+      </w:r>
+    </w:p>
+    <w:tbl>
+      <w:tblPr>
+        <w:tblW w:type="dxa" w:w="9900"/>
+        <w:tblBorders>
+          <w:top w:val="single" w:color="auto" w:sz="4"/>
+          <w:left w:val="single" w:color="auto" w:sz="4"/>
+          <w:bottom w:val="single" w:color="auto" w:sz="4"/>
+          <w:right w:val="single" w:color="auto" w:sz="4"/>
+          <w:insideH w:val="single" w:color="auto" w:sz="4"/>
+          <w:insideV w:val="single" w:color="auto" w:sz="4"/>
+        </w:tblBorders>
+      </w:tblPr>
+      <w:tblGrid>
+        <w:gridCol w:w="3700"/>
+        <w:gridCol w:w="1700"/>
+        <w:gridCol w:w="2000"/>
+        <w:gridCol w:w="2500"/>
+      </w:tblGrid>
+      <w:tr>
+        <w:trPr>
+          <w:tblHeader/>
+        </w:trPr>
+        <w:tc>
+          <w:tcPr>
+            <w:tcW w:type="dxa" w:w="3700"/>
+            <w:tcBorders>
+              <w:top w:val="single" w:color="D1D5DB" w:sz="4"/>
+              <w:left w:val="single" w:color="D1D5DB" w:sz="4"/>
+              <w:bottom w:val="single" w:color="D1D5DB" w:sz="4"/>
+              <w:right w:val="single" w:color="D1D5DB" w:sz="4"/>
+            </w:tcBorders>
+            <w:shd w:fill="E5E7EB" w:color="auto" w:val="clear"/>
+            <w:tcMar>
+              <w:top w:type="dxa" w:w="70"/>
+              <w:left w:type="dxa" w:w="110"/>
+              <w:bottom w:type="dxa" w:w="70"/>
+              <w:right w:type="dxa" w:w="110"/>
+            </w:tcMar>
+          </w:tcPr>
+          <w:p>
+            <w:r>
+              <w:rPr>
+                <w:rFonts w:ascii="Calibri" w:cs="Calibri" w:eastAsia="Calibri" w:hAnsi="Calibri"/>
+                <w:b/>
+                <w:bCs/>
+                <w:sz w:val="19"/>
+                <w:szCs w:val="19"/>
+              </w:rPr>
+              <w:t xml:space="preserve">Loading mode</w:t>
+            </w:r>
+          </w:p>
+        </w:tc>
+        <w:tc>
+          <w:tcPr>
+            <w:tcW w:type="dxa" w:w="1700"/>
+            <w:tcBorders>
+              <w:top w:val="single" w:color="D1D5DB" w:sz="4"/>
+              <w:left w:val="single" w:color="D1D5DB" w:sz="4"/>
+              <w:bottom w:val="single" w:color="D1D5DB" w:sz="4"/>
+              <w:right w:val="single" w:color="D1D5DB" w:sz="4"/>
+            </w:tcBorders>
+            <w:shd w:fill="E5E7EB" w:color="auto" w:val="clear"/>
+            <w:tcMar>
+              <w:top w:type="dxa" w:w="70"/>
+              <w:left w:type="dxa" w:w="110"/>
+              <w:bottom w:type="dxa" w:w="70"/>
+              <w:right w:type="dxa" w:w="110"/>
+            </w:tcMar>
+          </w:tcPr>
+          <w:p>
+            <w:r>
+              <w:rPr>
+                <w:rFonts w:ascii="Calibri" w:cs="Calibri" w:eastAsia="Calibri" w:hAnsi="Calibri"/>
+                <w:b/>
+                <w:bCs/>
+                <w:sz w:val="19"/>
+                <w:szCs w:val="19"/>
+              </w:rPr>
+              <w:t xml:space="preserve">Page load</w:t>
+            </w:r>
+          </w:p>
+        </w:tc>
+        <w:tc>
+          <w:tcPr>
+            <w:tcW w:type="dxa" w:w="2000"/>
+            <w:tcBorders>
+              <w:top w:val="single" w:color="D1D5DB" w:sz="4"/>
+              <w:left w:val="single" w:color="D1D5DB" w:sz="4"/>
+              <w:bottom w:val="single" w:color="D1D5DB" w:sz="4"/>
+              <w:right w:val="single" w:color="D1D5DB" w:sz="4"/>
+            </w:tcBorders>
+            <w:shd w:fill="E5E7EB" w:color="auto" w:val="clear"/>
+            <w:tcMar>
+              <w:top w:type="dxa" w:w="70"/>
+              <w:left w:type="dxa" w:w="110"/>
+              <w:bottom w:type="dxa" w:w="70"/>
+              <w:right w:type="dxa" w:w="110"/>
+            </w:tcMar>
+          </w:tcPr>
+          <w:p>
+            <w:r>
+              <w:rPr>
+                <w:rFonts w:ascii="Calibri" w:cs="Calibri" w:eastAsia="Calibri" w:hAnsi="Calibri"/>
+                <w:b/>
+                <w:bCs/>
+                <w:sz w:val="19"/>
+                <w:szCs w:val="19"/>
+              </w:rPr>
+              <w:t xml:space="preserve">Backend calls</w:t>
+            </w:r>
+          </w:p>
+        </w:tc>
+        <w:tc>
+          <w:tcPr>
+            <w:tcW w:type="dxa" w:w="2500"/>
+            <w:tcBorders>
+              <w:top w:val="single" w:color="D1D5DB" w:sz="4"/>
+              <w:left w:val="single" w:color="D1D5DB" w:sz="4"/>
+              <w:bottom w:val="single" w:color="D1D5DB" w:sz="4"/>
+              <w:right w:val="single" w:color="D1D5DB" w:sz="4"/>
+            </w:tcBorders>
+            <w:shd w:fill="E5E7EB" w:color="auto" w:val="clear"/>
+            <w:tcMar>
+              <w:top w:type="dxa" w:w="70"/>
+              <w:left w:type="dxa" w:w="110"/>
+              <w:bottom w:type="dxa" w:w="70"/>
+              <w:right w:type="dxa" w:w="110"/>
+            </w:tcMar>
+          </w:tcPr>
+          <w:p>
+            <w:r>
+              <w:rPr>
+                <w:rFonts w:ascii="Calibri" w:cs="Calibri" w:eastAsia="Calibri" w:hAnsi="Calibri"/>
+                <w:b/>
+                <w:bCs/>
+                <w:sz w:val="19"/>
+                <w:szCs w:val="19"/>
+              </w:rPr>
+              <w:t xml:space="preserve">Sequential hops</w:t>
+            </w:r>
+          </w:p>
+        </w:tc>
+      </w:tr>
+      <w:tr>
+        <w:trPr>
+          <w:cantSplit/>
+        </w:trPr>
+        <w:tc>
+          <w:tcPr>
+            <w:tcW w:type="dxa" w:w="3700"/>
+            <w:tcBorders>
+              <w:top w:val="single" w:color="D1D5DB" w:sz="4"/>
+              <w:left w:val="single" w:color="D1D5DB" w:sz="4"/>
+              <w:bottom w:val="single" w:color="D1D5DB" w:sz="4"/>
+              <w:right w:val="single" w:color="D1D5DB" w:sz="4"/>
+            </w:tcBorders>
+            <w:tcMar>
+              <w:top w:type="dxa" w:w="70"/>
+              <w:left w:type="dxa" w:w="110"/>
+              <w:bottom w:type="dxa" w:w="70"/>
+              <w:right w:type="dxa" w:w="110"/>
+            </w:tcMar>
+          </w:tcPr>
+          <w:p>
+            <w:r>
+              <w:rPr>
+                <w:rFonts w:ascii="Calibri" w:cs="Calibri" w:eastAsia="Calibri" w:hAnsi="Calibri"/>
+                <w:sz w:val="19"/>
+                <w:szCs w:val="19"/>
+              </w:rPr>
+              <w:t xml:space="preserve">Today's production (before this change)</w:t>
+            </w:r>
+          </w:p>
+        </w:tc>
+        <w:tc>
+          <w:tcPr>
+            <w:tcW w:type="dxa" w:w="1700"/>
+            <w:tcBorders>
+              <w:top w:val="single" w:color="D1D5DB" w:sz="4"/>
+              <w:left w:val="single" w:color="D1D5DB" w:sz="4"/>
+              <w:bottom w:val="single" w:color="D1D5DB" w:sz="4"/>
+              <w:right w:val="single" w:color="D1D5DB" w:sz="4"/>
+            </w:tcBorders>
+            <w:tcMar>
+              <w:top w:type="dxa" w:w="70"/>
+              <w:left w:type="dxa" w:w="110"/>
+              <w:bottom w:type="dxa" w:w="70"/>
+              <w:right w:type="dxa" w:w="110"/>
+            </w:tcMar>
+          </w:tcPr>
+          <w:p>
+            <w:r>
+              <w:rPr>
+                <w:rFonts w:ascii="Calibri" w:cs="Calibri" w:eastAsia="Calibri" w:hAnsi="Calibri"/>
+                <w:sz w:val="19"/>
+                <w:szCs w:val="19"/>
+              </w:rPr>
+              <w:t xml:space="preserve">648-709 ms</w:t>
+            </w:r>
+          </w:p>
+        </w:tc>
+        <w:tc>
+          <w:tcPr>
+            <w:tcW w:type="dxa" w:w="2000"/>
+            <w:tcBorders>
+              <w:top w:val="single" w:color="D1D5DB" w:sz="4"/>
+              <w:left w:val="single" w:color="D1D5DB" w:sz="4"/>
+              <w:bottom w:val="single" w:color="D1D5DB" w:sz="4"/>
+              <w:right w:val="single" w:color="D1D5DB" w:sz="4"/>
+            </w:tcBorders>
+            <w:tcMar>
+              <w:top w:type="dxa" w:w="70"/>
+              <w:left w:type="dxa" w:w="110"/>
+              <w:bottom w:type="dxa" w:w="70"/>
+              <w:right w:type="dxa" w:w="110"/>
+            </w:tcMar>
+          </w:tcPr>
+          <w:p>
+            <w:r>
+              <w:rPr>
+                <w:rFonts w:ascii="Calibri" w:cs="Calibri" w:eastAsia="Calibri" w:hAnsi="Calibri"/>
+                <w:sz w:val="19"/>
+                <w:szCs w:val="19"/>
+              </w:rPr>
+              <w:t xml:space="preserve">18</w:t>
+            </w:r>
+          </w:p>
+        </w:tc>
+        <w:tc>
+          <w:tcPr>
+            <w:tcW w:type="dxa" w:w="2500"/>
+            <w:tcBorders>
+              <w:top w:val="single" w:color="D1D5DB" w:sz="4"/>
+              <w:left w:val="single" w:color="D1D5DB" w:sz="4"/>
+              <w:bottom w:val="single" w:color="D1D5DB" w:sz="4"/>
+              <w:right w:val="single" w:color="D1D5DB" w:sz="4"/>
+            </w:tcBorders>
+            <w:tcMar>
+              <w:top w:type="dxa" w:w="70"/>
+              <w:left w:type="dxa" w:w="110"/>
+              <w:bottom w:type="dxa" w:w="70"/>
+              <w:right w:type="dxa" w:w="110"/>
+            </w:tcMar>
+          </w:tcPr>
+          <w:p>
+            <w:r>
+              <w:rPr>
+                <w:rFonts w:ascii="Calibri" w:cs="Calibri" w:eastAsia="Calibri" w:hAnsi="Calibri"/>
+                <w:sz w:val="19"/>
+                <w:szCs w:val="19"/>
+              </w:rPr>
+              <w:t xml:space="preserve">3</w:t>
+            </w:r>
+          </w:p>
+        </w:tc>
+      </w:tr>
+      <w:tr>
+        <w:trPr>
+          <w:cantSplit/>
+        </w:trPr>
+        <w:tc>
+          <w:tcPr>
+            <w:tcW w:type="dxa" w:w="3700"/>
+            <w:tcBorders>
+              <w:top w:val="single" w:color="D1D5DB" w:sz="4"/>
+              <w:left w:val="single" w:color="D1D5DB" w:sz="4"/>
+              <w:bottom w:val="single" w:color="D1D5DB" w:sz="4"/>
+              <w:right w:val="single" w:color="D1D5DB" w:sz="4"/>
+            </w:tcBorders>
+            <w:tcMar>
+              <w:top w:type="dxa" w:w="70"/>
+              <w:left w:type="dxa" w:w="110"/>
+              <w:bottom w:type="dxa" w:w="70"/>
+              <w:right w:type="dxa" w:w="110"/>
+            </w:tcMar>
+          </w:tcPr>
+          <w:p>
+            <w:r>
+              <w:rPr>
+                <w:rFonts w:ascii="Calibri" w:cs="Calibri" w:eastAsia="Calibri" w:hAnsi="Calibri"/>
+                <w:sz w:val="19"/>
+                <w:szCs w:val="19"/>
+              </w:rPr>
+              <w:t xml:space="preserve">Batched health and drift only</w:t>
+            </w:r>
+          </w:p>
+        </w:tc>
+        <w:tc>
+          <w:tcPr>
+            <w:tcW w:type="dxa" w:w="1700"/>
+            <w:tcBorders>
+              <w:top w:val="single" w:color="D1D5DB" w:sz="4"/>
+              <w:left w:val="single" w:color="D1D5DB" w:sz="4"/>
+              <w:bottom w:val="single" w:color="D1D5DB" w:sz="4"/>
+              <w:right w:val="single" w:color="D1D5DB" w:sz="4"/>
+            </w:tcBorders>
+            <w:tcMar>
+              <w:top w:type="dxa" w:w="70"/>
+              <w:left w:type="dxa" w:w="110"/>
+              <w:bottom w:type="dxa" w:w="70"/>
+              <w:right w:type="dxa" w:w="110"/>
+            </w:tcMar>
+          </w:tcPr>
+          <w:p>
+            <w:r>
+              <w:rPr>
+                <w:rFonts w:ascii="Calibri" w:cs="Calibri" w:eastAsia="Calibri" w:hAnsi="Calibri"/>
+                <w:sz w:val="19"/>
+                <w:szCs w:val="19"/>
+              </w:rPr>
+              <w:t xml:space="preserve">634-649 ms</w:t>
+            </w:r>
+          </w:p>
+        </w:tc>
+        <w:tc>
+          <w:tcPr>
+            <w:tcW w:type="dxa" w:w="2000"/>
+            <w:tcBorders>
+              <w:top w:val="single" w:color="D1D5DB" w:sz="4"/>
+              <w:left w:val="single" w:color="D1D5DB" w:sz="4"/>
+              <w:bottom w:val="single" w:color="D1D5DB" w:sz="4"/>
+              <w:right w:val="single" w:color="D1D5DB" w:sz="4"/>
+            </w:tcBorders>
+            <w:tcMar>
+              <w:top w:type="dxa" w:w="70"/>
+              <w:left w:type="dxa" w:w="110"/>
+              <w:bottom w:type="dxa" w:w="70"/>
+              <w:right w:type="dxa" w:w="110"/>
+            </w:tcMar>
+          </w:tcPr>
+          <w:p>
+            <w:r>
+              <w:rPr>
+                <w:rFonts w:ascii="Calibri" w:cs="Calibri" w:eastAsia="Calibri" w:hAnsi="Calibri"/>
+                <w:sz w:val="19"/>
+                <w:szCs w:val="19"/>
+              </w:rPr>
+              <w:t xml:space="preserve">14</w:t>
+            </w:r>
+          </w:p>
+        </w:tc>
+        <w:tc>
+          <w:tcPr>
+            <w:tcW w:type="dxa" w:w="2500"/>
+            <w:tcBorders>
+              <w:top w:val="single" w:color="D1D5DB" w:sz="4"/>
+              <w:left w:val="single" w:color="D1D5DB" w:sz="4"/>
+              <w:bottom w:val="single" w:color="D1D5DB" w:sz="4"/>
+              <w:right w:val="single" w:color="D1D5DB" w:sz="4"/>
+            </w:tcBorders>
+            <w:tcMar>
+              <w:top w:type="dxa" w:w="70"/>
+              <w:left w:type="dxa" w:w="110"/>
+              <w:bottom w:type="dxa" w:w="70"/>
+              <w:right w:type="dxa" w:w="110"/>
+            </w:tcMar>
+          </w:tcPr>
+          <w:p>
+            <w:r>
+              <w:rPr>
+                <w:rFonts w:ascii="Calibri" w:cs="Calibri" w:eastAsia="Calibri" w:hAnsi="Calibri"/>
+                <w:sz w:val="19"/>
+                <w:szCs w:val="19"/>
+              </w:rPr>
+              <w:t xml:space="preserve">3</w:t>
+            </w:r>
+          </w:p>
+        </w:tc>
+      </w:tr>
+      <w:tr>
+        <w:trPr>
+          <w:cantSplit/>
+        </w:trPr>
+        <w:tc>
+          <w:tcPr>
+            <w:tcW w:type="dxa" w:w="3700"/>
+            <w:tcBorders>
+              <w:top w:val="single" w:color="D1D5DB" w:sz="4"/>
+              <w:left w:val="single" w:color="D1D5DB" w:sz="4"/>
+              <w:bottom w:val="single" w:color="D1D5DB" w:sz="4"/>
+              <w:right w:val="single" w:color="D1D5DB" w:sz="4"/>
+            </w:tcBorders>
+            <w:tcMar>
+              <w:top w:type="dxa" w:w="70"/>
+              <w:left w:type="dxa" w:w="110"/>
+              <w:bottom w:type="dxa" w:w="70"/>
+              <w:right w:type="dxa" w:w="110"/>
+            </w:tcMar>
+          </w:tcPr>
+          <w:p>
+            <w:r>
+              <w:rPr>
+                <w:rFonts w:ascii="Calibri" w:cs="Calibri" w:eastAsia="Calibri" w:hAnsi="Calibri"/>
+                <w:b/>
+                <w:bCs/>
+                <w:sz w:val="19"/>
+                <w:szCs w:val="19"/>
+              </w:rPr>
+              <w:t xml:space="preserve">One workspace request</w:t>
+            </w:r>
+          </w:p>
+        </w:tc>
+        <w:tc>
+          <w:tcPr>
+            <w:tcW w:type="dxa" w:w="1700"/>
+            <w:tcBorders>
+              <w:top w:val="single" w:color="D1D5DB" w:sz="4"/>
+              <w:left w:val="single" w:color="D1D5DB" w:sz="4"/>
+              <w:bottom w:val="single" w:color="D1D5DB" w:sz="4"/>
+              <w:right w:val="single" w:color="D1D5DB" w:sz="4"/>
+            </w:tcBorders>
+            <w:tcMar>
+              <w:top w:type="dxa" w:w="70"/>
+              <w:left w:type="dxa" w:w="110"/>
+              <w:bottom w:type="dxa" w:w="70"/>
+              <w:right w:type="dxa" w:w="110"/>
+            </w:tcMar>
+          </w:tcPr>
+          <w:p>
+            <w:r>
+              <w:rPr>
+                <w:rFonts w:ascii="Calibri" w:cs="Calibri" w:eastAsia="Calibri" w:hAnsi="Calibri"/>
+                <w:b/>
+                <w:bCs/>
+                <w:color w:val="15803D"/>
+                <w:sz w:val="19"/>
+                <w:szCs w:val="19"/>
+              </w:rPr>
+              <w:t xml:space="preserve">372-402 ms</w:t>
+            </w:r>
+          </w:p>
+        </w:tc>
+        <w:tc>
+          <w:tcPr>
+            <w:tcW w:type="dxa" w:w="2000"/>
+            <w:tcBorders>
+              <w:top w:val="single" w:color="D1D5DB" w:sz="4"/>
+              <w:left w:val="single" w:color="D1D5DB" w:sz="4"/>
+              <w:bottom w:val="single" w:color="D1D5DB" w:sz="4"/>
+              <w:right w:val="single" w:color="D1D5DB" w:sz="4"/>
+            </w:tcBorders>
+            <w:tcMar>
+              <w:top w:type="dxa" w:w="70"/>
+              <w:left w:type="dxa" w:w="110"/>
+              <w:bottom w:type="dxa" w:w="70"/>
+              <w:right w:type="dxa" w:w="110"/>
+            </w:tcMar>
+          </w:tcPr>
+          <w:p>
+            <w:r>
+              <w:rPr>
+                <w:rFonts w:ascii="Calibri" w:cs="Calibri" w:eastAsia="Calibri" w:hAnsi="Calibri"/>
+                <w:b/>
+                <w:bCs/>
+                <w:color w:val="15803D"/>
+                <w:sz w:val="19"/>
+                <w:szCs w:val="19"/>
+              </w:rPr>
+              <w:t xml:space="preserve">3</w:t>
+            </w:r>
+          </w:p>
+        </w:tc>
+        <w:tc>
+          <w:tcPr>
+            <w:tcW w:type="dxa" w:w="2500"/>
+            <w:tcBorders>
+              <w:top w:val="single" w:color="D1D5DB" w:sz="4"/>
+              <w:left w:val="single" w:color="D1D5DB" w:sz="4"/>
+              <w:bottom w:val="single" w:color="D1D5DB" w:sz="4"/>
+              <w:right w:val="single" w:color="D1D5DB" w:sz="4"/>
+            </w:tcBorders>
+            <w:tcMar>
+              <w:top w:type="dxa" w:w="70"/>
+              <w:left w:type="dxa" w:w="110"/>
+              <w:bottom w:type="dxa" w:w="70"/>
+              <w:right w:type="dxa" w:w="110"/>
+            </w:tcMar>
+          </w:tcPr>
+          <w:p>
+            <w:r>
+              <w:rPr>
+                <w:rFonts w:ascii="Calibri" w:cs="Calibri" w:eastAsia="Calibri" w:hAnsi="Calibri"/>
+                <w:b/>
+                <w:bCs/>
+                <w:color w:val="15803D"/>
+                <w:sz w:val="19"/>
+                <w:szCs w:val="19"/>
+              </w:rPr>
+              <w:t xml:space="preserve">2</w:t>
+            </w:r>
+          </w:p>
+        </w:tc>
+      </w:tr>
+    </w:tbl>
+    <w:p>
+      <w:pPr>
+        <w:spacing w:after="100"/>
+      </w:pPr>
+    </w:p>
+    <w:p>
+      <w:pPr>
+        <w:spacing w:after="110" w:line="276"/>
+      </w:pPr>
+      <w:r>
+        <w:rPr>
+          <w:rFonts w:ascii="Calibri" w:cs="Calibri" w:eastAsia="Calibri" w:hAnsi="Calibri"/>
+          <w:color w:val="1F2937"/>
+          <w:sz w:val="21"/>
+          <w:szCs w:val="21"/>
+        </w:rPr>
+        <w:t xml:space="preserve">The three backend calls are the session check, the workspace request, and the page-title lookup, which runs alongside. The page returned by all three modes is byte-for-byte identical, so only the way the data is loaded changed. Wrong-project, missing-experiment and invalid-key requests behave as before. The new route returns exactly what the separate routes return, piece by piece, in an end-to-end test against a real database (243 end-to-end tests pass).</w:t>
+      </w:r>
+    </w:p>
+    <w:p>
+      <w:pPr>
+        <w:pStyle w:val="Heading1"/>
+        <w:spacing w:after="140" w:before="320"/>
+      </w:pPr>
+      <w:r>
+        <w:rPr>
+          <w:rFonts w:ascii="Calibri" w:cs="Calibri" w:eastAsia="Calibri" w:hAnsi="Calibri"/>
+          <w:b/>
+          <w:bCs/>
+          <w:color w:val="1F2937"/>
+          <w:sz w:val="32"/>
+          <w:szCs w:val="32"/>
+        </w:rPr>
+        <w:t xml:space="preserve">7. After the second deploy: production</w:t>
+      </w:r>
+    </w:p>
+    <w:p>
+      <w:pPr>
+        <w:spacing w:after="110" w:line="276"/>
+      </w:pPr>
+      <w:r>
+        <w:rPr>
+          <w:rFonts w:ascii="Calibri" w:cs="Calibri" w:eastAsia="Calibri" w:hAnsi="Calibri"/>
+          <w:color w:val="1F2937"/>
+          <w:sz w:val="21"/>
+          <w:szCs w:val="21"/>
+        </w:rPr>
+        <w:t xml:space="preserve">Same account and experiment as before.</w:t>
+      </w:r>
+    </w:p>
+    <w:tbl>
+      <w:tblPr>
+        <w:tblW w:type="dxa" w:w="9900"/>
+        <w:tblBorders>
+          <w:top w:val="single" w:color="auto" w:sz="4"/>
+          <w:left w:val="single" w:color="auto" w:sz="4"/>
+          <w:bottom w:val="single" w:color="auto" w:sz="4"/>
+          <w:right w:val="single" w:color="auto" w:sz="4"/>
+          <w:insideH w:val="single" w:color="auto" w:sz="4"/>
+          <w:insideV w:val="single" w:color="auto" w:sz="4"/>
+        </w:tblBorders>
+      </w:tblPr>
+      <w:tblGrid>
+        <w:gridCol w:w="3600"/>
+        <w:gridCol w:w="2100"/>
+        <w:gridCol w:w="2100"/>
+        <w:gridCol w:w="2100"/>
+      </w:tblGrid>
+      <w:tr>
+        <w:trPr>
+          <w:tblHeader/>
+        </w:trPr>
+        <w:tc>
+          <w:tcPr>
+            <w:tcW w:type="dxa" w:w="3600"/>
+            <w:tcBorders>
+              <w:top w:val="single" w:color="D1D5DB" w:sz="4"/>
+              <w:left w:val="single" w:color="D1D5DB" w:sz="4"/>
+              <w:bottom w:val="single" w:color="D1D5DB" w:sz="4"/>
+              <w:right w:val="single" w:color="D1D5DB" w:sz="4"/>
+            </w:tcBorders>
+            <w:shd w:fill="E5E7EB" w:color="auto" w:val="clear"/>
+            <w:tcMar>
+              <w:top w:type="dxa" w:w="70"/>
+              <w:left w:type="dxa" w:w="110"/>
+              <w:bottom w:type="dxa" w:w="70"/>
+              <w:right w:type="dxa" w:w="110"/>
+            </w:tcMar>
+          </w:tcPr>
+          <w:p>
+            <w:r>
+              <w:rPr>
+                <w:rFonts w:ascii="Calibri" w:cs="Calibri" w:eastAsia="Calibri" w:hAnsi="Calibri"/>
+                <w:b/>
+                <w:bCs/>
+                <w:sz w:val="19"/>
+                <w:szCs w:val="19"/>
+              </w:rPr>
+              <w:t xml:space="preserve">Measure</w:t>
+            </w:r>
+          </w:p>
+        </w:tc>
+        <w:tc>
+          <w:tcPr>
+            <w:tcW w:type="dxa" w:w="2100"/>
+            <w:tcBorders>
+              <w:top w:val="single" w:color="D1D5DB" w:sz="4"/>
+              <w:left w:val="single" w:color="D1D5DB" w:sz="4"/>
+              <w:bottom w:val="single" w:color="D1D5DB" w:sz="4"/>
+              <w:right w:val="single" w:color="D1D5DB" w:sz="4"/>
+            </w:tcBorders>
+            <w:shd w:fill="E5E7EB" w:color="auto" w:val="clear"/>
+            <w:tcMar>
+              <w:top w:type="dxa" w:w="70"/>
+              <w:left w:type="dxa" w:w="110"/>
+              <w:bottom w:type="dxa" w:w="70"/>
+              <w:right w:type="dxa" w:w="110"/>
+            </w:tcMar>
+          </w:tcPr>
+          <w:p>
+            <w:r>
+              <w:rPr>
+                <w:rFonts w:ascii="Calibri" w:cs="Calibri" w:eastAsia="Calibri" w:hAnsi="Calibri"/>
+                <w:b/>
+                <w:bCs/>
+                <w:sz w:val="19"/>
+                <w:szCs w:val="19"/>
+              </w:rPr>
+              <w:t xml:space="preserve">Before this change</w:t>
+            </w:r>
+          </w:p>
+        </w:tc>
+        <w:tc>
+          <w:tcPr>
+            <w:tcW w:type="dxa" w:w="2100"/>
+            <w:tcBorders>
+              <w:top w:val="single" w:color="D1D5DB" w:sz="4"/>
+              <w:left w:val="single" w:color="D1D5DB" w:sz="4"/>
+              <w:bottom w:val="single" w:color="D1D5DB" w:sz="4"/>
+              <w:right w:val="single" w:color="D1D5DB" w:sz="4"/>
+            </w:tcBorders>
+            <w:shd w:fill="E5E7EB" w:color="auto" w:val="clear"/>
+            <w:tcMar>
+              <w:top w:type="dxa" w:w="70"/>
+              <w:left w:type="dxa" w:w="110"/>
+              <w:bottom w:type="dxa" w:w="70"/>
+              <w:right w:type="dxa" w:w="110"/>
+            </w:tcMar>
+          </w:tcPr>
+          <w:p>
+            <w:r>
+              <w:rPr>
+                <w:rFonts w:ascii="Calibri" w:cs="Calibri" w:eastAsia="Calibri" w:hAnsi="Calibri"/>
+                <w:b/>
+                <w:bCs/>
+                <w:sz w:val="19"/>
+                <w:szCs w:val="19"/>
+              </w:rPr>
+              <w:t xml:space="preserve">Now</w:t>
+            </w:r>
+          </w:p>
+        </w:tc>
+        <w:tc>
+          <w:tcPr>
+            <w:tcW w:type="dxa" w:w="2100"/>
+            <w:tcBorders>
+              <w:top w:val="single" w:color="D1D5DB" w:sz="4"/>
+              <w:left w:val="single" w:color="D1D5DB" w:sz="4"/>
+              <w:bottom w:val="single" w:color="D1D5DB" w:sz="4"/>
+              <w:right w:val="single" w:color="D1D5DB" w:sz="4"/>
+            </w:tcBorders>
+            <w:shd w:fill="E5E7EB" w:color="auto" w:val="clear"/>
+            <w:tcMar>
+              <w:top w:type="dxa" w:w="70"/>
+              <w:left w:type="dxa" w:w="110"/>
+              <w:bottom w:type="dxa" w:w="70"/>
+              <w:right w:type="dxa" w:w="110"/>
+            </w:tcMar>
+          </w:tcPr>
+          <w:p>
+            <w:r>
+              <w:rPr>
+                <w:rFonts w:ascii="Calibri" w:cs="Calibri" w:eastAsia="Calibri" w:hAnsi="Calibri"/>
+                <w:b/>
+                <w:bCs/>
+                <w:sz w:val="19"/>
+                <w:szCs w:val="19"/>
+              </w:rPr>
+              <w:t xml:space="preserve">Change</w:t>
+            </w:r>
+          </w:p>
+        </w:tc>
+      </w:tr>
+      <w:tr>
+        <w:trPr>
+          <w:cantSplit/>
+        </w:trPr>
+        <w:tc>
+          <w:tcPr>
+            <w:tcW w:type="dxa" w:w="3600"/>
+            <w:tcBorders>
+              <w:top w:val="single" w:color="D1D5DB" w:sz="4"/>
+              <w:left w:val="single" w:color="D1D5DB" w:sz="4"/>
+              <w:bottom w:val="single" w:color="D1D5DB" w:sz="4"/>
+              <w:right w:val="single" w:color="D1D5DB" w:sz="4"/>
+            </w:tcBorders>
+            <w:tcMar>
+              <w:top w:type="dxa" w:w="70"/>
+              <w:left w:type="dxa" w:w="110"/>
+              <w:bottom w:type="dxa" w:w="70"/>
+              <w:right w:type="dxa" w:w="110"/>
+            </w:tcMar>
+          </w:tcPr>
+          <w:p>
+            <w:r>
+              <w:rPr>
+                <w:rFonts w:ascii="Calibri" w:cs="Calibri" w:eastAsia="Calibri" w:hAnsi="Calibri"/>
+                <w:sz w:val="19"/>
+                <w:szCs w:val="19"/>
+              </w:rPr>
+              <w:t xml:space="preserve">Server render of the page (5 fetches)</w:t>
+            </w:r>
+          </w:p>
+        </w:tc>
+        <w:tc>
+          <w:tcPr>
+            <w:tcW w:type="dxa" w:w="2100"/>
+            <w:tcBorders>
+              <w:top w:val="single" w:color="D1D5DB" w:sz="4"/>
+              <w:left w:val="single" w:color="D1D5DB" w:sz="4"/>
+              <w:bottom w:val="single" w:color="D1D5DB" w:sz="4"/>
+              <w:right w:val="single" w:color="D1D5DB" w:sz="4"/>
+            </w:tcBorders>
+            <w:tcMar>
+              <w:top w:type="dxa" w:w="70"/>
+              <w:left w:type="dxa" w:w="110"/>
+              <w:bottom w:type="dxa" w:w="70"/>
+              <w:right w:type="dxa" w:w="110"/>
+            </w:tcMar>
+          </w:tcPr>
+          <w:p>
+            <w:r>
+              <w:rPr>
+                <w:rFonts w:ascii="Calibri" w:cs="Calibri" w:eastAsia="Calibri" w:hAnsi="Calibri"/>
+                <w:sz w:val="19"/>
+                <w:szCs w:val="19"/>
+              </w:rPr>
+              <w:t xml:space="preserve">2015 ms</w:t>
+            </w:r>
+          </w:p>
+        </w:tc>
+        <w:tc>
+          <w:tcPr>
+            <w:tcW w:type="dxa" w:w="2100"/>
+            <w:tcBorders>
+              <w:top w:val="single" w:color="D1D5DB" w:sz="4"/>
+              <w:left w:val="single" w:color="D1D5DB" w:sz="4"/>
+              <w:bottom w:val="single" w:color="D1D5DB" w:sz="4"/>
+              <w:right w:val="single" w:color="D1D5DB" w:sz="4"/>
+            </w:tcBorders>
+            <w:tcMar>
+              <w:top w:type="dxa" w:w="70"/>
+              <w:left w:type="dxa" w:w="110"/>
+              <w:bottom w:type="dxa" w:w="70"/>
+              <w:right w:type="dxa" w:w="110"/>
+            </w:tcMar>
+          </w:tcPr>
+          <w:p>
+            <w:r>
+              <w:rPr>
+                <w:rFonts w:ascii="Calibri" w:cs="Calibri" w:eastAsia="Calibri" w:hAnsi="Calibri"/>
+                <w:b/>
+                <w:bCs/>
+                <w:color w:val="15803D"/>
+                <w:sz w:val="19"/>
+                <w:szCs w:val="19"/>
+              </w:rPr>
+              <w:t xml:space="preserve">834-1073 ms, median 871</w:t>
+            </w:r>
+          </w:p>
+        </w:tc>
+        <w:tc>
+          <w:tcPr>
+            <w:tcW w:type="dxa" w:w="2100"/>
+            <w:tcBorders>
+              <w:top w:val="single" w:color="D1D5DB" w:sz="4"/>
+              <w:left w:val="single" w:color="D1D5DB" w:sz="4"/>
+              <w:bottom w:val="single" w:color="D1D5DB" w:sz="4"/>
+              <w:right w:val="single" w:color="D1D5DB" w:sz="4"/>
+            </w:tcBorders>
+            <w:tcMar>
+              <w:top w:type="dxa" w:w="70"/>
+              <w:left w:type="dxa" w:w="110"/>
+              <w:bottom w:type="dxa" w:w="70"/>
+              <w:right w:type="dxa" w:w="110"/>
+            </w:tcMar>
+          </w:tcPr>
+          <w:p>
+            <w:r>
+              <w:rPr>
+                <w:rFonts w:ascii="Calibri" w:cs="Calibri" w:eastAsia="Calibri" w:hAnsi="Calibri"/>
+                <w:b/>
+                <w:bCs/>
+                <w:color w:val="15803D"/>
+                <w:sz w:val="19"/>
+                <w:szCs w:val="19"/>
+              </w:rPr>
+              <w:t xml:space="preserve">about 2.3x faster</w:t>
+            </w:r>
+          </w:p>
+        </w:tc>
+      </w:tr>
+      <w:tr>
+        <w:trPr>
+          <w:cantSplit/>
+        </w:trPr>
+        <w:tc>
+          <w:tcPr>
+            <w:tcW w:type="dxa" w:w="3600"/>
+            <w:tcBorders>
+              <w:top w:val="single" w:color="D1D5DB" w:sz="4"/>
+              <w:left w:val="single" w:color="D1D5DB" w:sz="4"/>
+              <w:bottom w:val="single" w:color="D1D5DB" w:sz="4"/>
+              <w:right w:val="single" w:color="D1D5DB" w:sz="4"/>
+            </w:tcBorders>
+            <w:tcMar>
+              <w:top w:type="dxa" w:w="70"/>
+              <w:left w:type="dxa" w:w="110"/>
+              <w:bottom w:type="dxa" w:w="70"/>
+              <w:right w:type="dxa" w:w="110"/>
+            </w:tcMar>
+          </w:tcPr>
+          <w:p>
+            <w:r>
+              <w:rPr>
+                <w:rFonts w:ascii="Calibri" w:cs="Calibri" w:eastAsia="Calibri" w:hAnsi="Calibri"/>
+                <w:sz w:val="19"/>
+                <w:szCs w:val="19"/>
+              </w:rPr>
+              <w:t xml:space="preserve">Hard page load, ready (3 loads)</w:t>
+            </w:r>
+          </w:p>
+        </w:tc>
+        <w:tc>
+          <w:tcPr>
+            <w:tcW w:type="dxa" w:w="2100"/>
+            <w:tcBorders>
+              <w:top w:val="single" w:color="D1D5DB" w:sz="4"/>
+              <w:left w:val="single" w:color="D1D5DB" w:sz="4"/>
+              <w:bottom w:val="single" w:color="D1D5DB" w:sz="4"/>
+              <w:right w:val="single" w:color="D1D5DB" w:sz="4"/>
+            </w:tcBorders>
+            <w:tcMar>
+              <w:top w:type="dxa" w:w="70"/>
+              <w:left w:type="dxa" w:w="110"/>
+              <w:bottom w:type="dxa" w:w="70"/>
+              <w:right w:type="dxa" w:w="110"/>
+            </w:tcMar>
+          </w:tcPr>
+          <w:p>
+            <w:r>
+              <w:rPr>
+                <w:rFonts w:ascii="Calibri" w:cs="Calibri" w:eastAsia="Calibri" w:hAnsi="Calibri"/>
+                <w:sz w:val="19"/>
+                <w:szCs w:val="19"/>
+              </w:rPr>
+              <w:t xml:space="preserve">2439 ms</w:t>
+            </w:r>
+          </w:p>
+        </w:tc>
+        <w:tc>
+          <w:tcPr>
+            <w:tcW w:type="dxa" w:w="2100"/>
+            <w:tcBorders>
+              <w:top w:val="single" w:color="D1D5DB" w:sz="4"/>
+              <w:left w:val="single" w:color="D1D5DB" w:sz="4"/>
+              <w:bottom w:val="single" w:color="D1D5DB" w:sz="4"/>
+              <w:right w:val="single" w:color="D1D5DB" w:sz="4"/>
+            </w:tcBorders>
+            <w:tcMar>
+              <w:top w:type="dxa" w:w="70"/>
+              <w:left w:type="dxa" w:w="110"/>
+              <w:bottom w:type="dxa" w:w="70"/>
+              <w:right w:type="dxa" w:w="110"/>
+            </w:tcMar>
+          </w:tcPr>
+          <w:p>
+            <w:r>
+              <w:rPr>
+                <w:rFonts w:ascii="Calibri" w:cs="Calibri" w:eastAsia="Calibri" w:hAnsi="Calibri"/>
+                <w:b/>
+                <w:bCs/>
+                <w:color w:val="15803D"/>
+                <w:sz w:val="19"/>
+                <w:szCs w:val="19"/>
+              </w:rPr>
+              <w:t xml:space="preserve">1117-1994 ms, median 1604</w:t>
+            </w:r>
+          </w:p>
+        </w:tc>
+        <w:tc>
+          <w:tcPr>
+            <w:tcW w:type="dxa" w:w="2100"/>
+            <w:tcBorders>
+              <w:top w:val="single" w:color="D1D5DB" w:sz="4"/>
+              <w:left w:val="single" w:color="D1D5DB" w:sz="4"/>
+              <w:bottom w:val="single" w:color="D1D5DB" w:sz="4"/>
+              <w:right w:val="single" w:color="D1D5DB" w:sz="4"/>
+            </w:tcBorders>
+            <w:tcMar>
+              <w:top w:type="dxa" w:w="70"/>
+              <w:left w:type="dxa" w:w="110"/>
+              <w:bottom w:type="dxa" w:w="70"/>
+              <w:right w:type="dxa" w:w="110"/>
+            </w:tcMar>
+          </w:tcPr>
+          <w:p>
+            <w:r>
+              <w:rPr>
+                <w:rFonts w:ascii="Calibri" w:cs="Calibri" w:eastAsia="Calibri" w:hAnsi="Calibri"/>
+                <w:b/>
+                <w:bCs/>
+                <w:color w:val="15803D"/>
+                <w:sz w:val="19"/>
+                <w:szCs w:val="19"/>
+              </w:rPr>
+              <w:t xml:space="preserve">about 1.5x faster</w:t>
+            </w:r>
+          </w:p>
+        </w:tc>
+      </w:tr>
+      <w:tr>
+        <w:trPr>
+          <w:cantSplit/>
+        </w:trPr>
+        <w:tc>
+          <w:tcPr>
+            <w:tcW w:type="dxa" w:w="3600"/>
+            <w:tcBorders>
+              <w:top w:val="single" w:color="D1D5DB" w:sz="4"/>
+              <w:left w:val="single" w:color="D1D5DB" w:sz="4"/>
+              <w:bottom w:val="single" w:color="D1D5DB" w:sz="4"/>
+              <w:right w:val="single" w:color="D1D5DB" w:sz="4"/>
+            </w:tcBorders>
+            <w:tcMar>
+              <w:top w:type="dxa" w:w="70"/>
+              <w:left w:type="dxa" w:w="110"/>
+              <w:bottom w:type="dxa" w:w="70"/>
+              <w:right w:type="dxa" w:w="110"/>
+            </w:tcMar>
+          </w:tcPr>
+          <w:p>
+            <w:r>
+              <w:rPr>
+                <w:rFonts w:ascii="Calibri" w:cs="Calibri" w:eastAsia="Calibri" w:hAnsi="Calibri"/>
+                <w:sz w:val="19"/>
+                <w:szCs w:val="19"/>
+              </w:rPr>
+              <w:t xml:space="preserve">Refresh data</w:t>
+            </w:r>
+          </w:p>
+        </w:tc>
+        <w:tc>
+          <w:tcPr>
+            <w:tcW w:type="dxa" w:w="2100"/>
+            <w:tcBorders>
+              <w:top w:val="single" w:color="D1D5DB" w:sz="4"/>
+              <w:left w:val="single" w:color="D1D5DB" w:sz="4"/>
+              <w:bottom w:val="single" w:color="D1D5DB" w:sz="4"/>
+              <w:right w:val="single" w:color="D1D5DB" w:sz="4"/>
+            </w:tcBorders>
+            <w:tcMar>
+              <w:top w:type="dxa" w:w="70"/>
+              <w:left w:type="dxa" w:w="110"/>
+              <w:bottom w:type="dxa" w:w="70"/>
+              <w:right w:type="dxa" w:w="110"/>
+            </w:tcMar>
+          </w:tcPr>
+          <w:p>
+            <w:r>
+              <w:rPr>
+                <w:rFonts w:ascii="Calibri" w:cs="Calibri" w:eastAsia="Calibri" w:hAnsi="Calibri"/>
+                <w:sz w:val="19"/>
+                <w:szCs w:val="19"/>
+              </w:rPr>
+              <w:t xml:space="preserve">2074 ms</w:t>
+            </w:r>
+          </w:p>
+        </w:tc>
+        <w:tc>
+          <w:tcPr>
+            <w:tcW w:type="dxa" w:w="2100"/>
+            <w:tcBorders>
+              <w:top w:val="single" w:color="D1D5DB" w:sz="4"/>
+              <w:left w:val="single" w:color="D1D5DB" w:sz="4"/>
+              <w:bottom w:val="single" w:color="D1D5DB" w:sz="4"/>
+              <w:right w:val="single" w:color="D1D5DB" w:sz="4"/>
+            </w:tcBorders>
+            <w:tcMar>
+              <w:top w:type="dxa" w:w="70"/>
+              <w:left w:type="dxa" w:w="110"/>
+              <w:bottom w:type="dxa" w:w="70"/>
+              <w:right w:type="dxa" w:w="110"/>
+            </w:tcMar>
+          </w:tcPr>
+          <w:p>
+            <w:r>
+              <w:rPr>
+                <w:rFonts w:ascii="Calibri" w:cs="Calibri" w:eastAsia="Calibri" w:hAnsi="Calibri"/>
+                <w:b/>
+                <w:bCs/>
+                <w:color w:val="15803D"/>
+                <w:sz w:val="19"/>
+                <w:szCs w:val="19"/>
+              </w:rPr>
+              <w:t xml:space="preserve">1257 ms</w:t>
+            </w:r>
+          </w:p>
+        </w:tc>
+        <w:tc>
+          <w:tcPr>
+            <w:tcW w:type="dxa" w:w="2100"/>
+            <w:tcBorders>
+              <w:top w:val="single" w:color="D1D5DB" w:sz="4"/>
+              <w:left w:val="single" w:color="D1D5DB" w:sz="4"/>
+              <w:bottom w:val="single" w:color="D1D5DB" w:sz="4"/>
+              <w:right w:val="single" w:color="D1D5DB" w:sz="4"/>
+            </w:tcBorders>
+            <w:tcMar>
+              <w:top w:type="dxa" w:w="70"/>
+              <w:left w:type="dxa" w:w="110"/>
+              <w:bottom w:type="dxa" w:w="70"/>
+              <w:right w:type="dxa" w:w="110"/>
+            </w:tcMar>
+          </w:tcPr>
+          <w:p>
+            <w:r>
+              <w:rPr>
+                <w:rFonts w:ascii="Calibri" w:cs="Calibri" w:eastAsia="Calibri" w:hAnsi="Calibri"/>
+                <w:b/>
+                <w:bCs/>
+                <w:color w:val="15803D"/>
+                <w:sz w:val="19"/>
+                <w:szCs w:val="19"/>
+              </w:rPr>
+              <w:t xml:space="preserve">-40%</w:t>
+            </w:r>
+          </w:p>
+        </w:tc>
+      </w:tr>
+      <w:tr>
+        <w:trPr>
+          <w:cantSplit/>
+        </w:trPr>
+        <w:tc>
+          <w:tcPr>
+            <w:tcW w:type="dxa" w:w="3600"/>
+            <w:tcBorders>
+              <w:top w:val="single" w:color="D1D5DB" w:sz="4"/>
+              <w:left w:val="single" w:color="D1D5DB" w:sz="4"/>
+              <w:bottom w:val="single" w:color="D1D5DB" w:sz="4"/>
+              <w:right w:val="single" w:color="D1D5DB" w:sz="4"/>
+            </w:tcBorders>
+            <w:tcMar>
+              <w:top w:type="dxa" w:w="70"/>
+              <w:left w:type="dxa" w:w="110"/>
+              <w:bottom w:type="dxa" w:w="70"/>
+              <w:right w:type="dxa" w:w="110"/>
+            </w:tcMar>
+          </w:tcPr>
+          <w:p>
+            <w:r>
+              <w:rPr>
+                <w:rFonts w:ascii="Calibri" w:cs="Calibri" w:eastAsia="Calibri" w:hAnsi="Calibri"/>
+                <w:sz w:val="19"/>
+                <w:szCs w:val="19"/>
+              </w:rPr>
+              <w:t xml:space="preserve">Tab click, UI changed (8 clicks)</w:t>
+            </w:r>
+          </w:p>
+        </w:tc>
+        <w:tc>
+          <w:tcPr>
+            <w:tcW w:type="dxa" w:w="2100"/>
+            <w:tcBorders>
+              <w:top w:val="single" w:color="D1D5DB" w:sz="4"/>
+              <w:left w:val="single" w:color="D1D5DB" w:sz="4"/>
+              <w:bottom w:val="single" w:color="D1D5DB" w:sz="4"/>
+              <w:right w:val="single" w:color="D1D5DB" w:sz="4"/>
+            </w:tcBorders>
+            <w:tcMar>
+              <w:top w:type="dxa" w:w="70"/>
+              <w:left w:type="dxa" w:w="110"/>
+              <w:bottom w:type="dxa" w:w="70"/>
+              <w:right w:type="dxa" w:w="110"/>
+            </w:tcMar>
+          </w:tcPr>
+          <w:p>
+            <w:r>
+              <w:rPr>
+                <w:rFonts w:ascii="Calibri" w:cs="Calibri" w:eastAsia="Calibri" w:hAnsi="Calibri"/>
+                <w:sz w:val="19"/>
+                <w:szCs w:val="19"/>
+              </w:rPr>
+              <w:t xml:space="preserve">8-24 ms</w:t>
+            </w:r>
+          </w:p>
+        </w:tc>
+        <w:tc>
+          <w:tcPr>
+            <w:tcW w:type="dxa" w:w="2100"/>
+            <w:tcBorders>
+              <w:top w:val="single" w:color="D1D5DB" w:sz="4"/>
+              <w:left w:val="single" w:color="D1D5DB" w:sz="4"/>
+              <w:bottom w:val="single" w:color="D1D5DB" w:sz="4"/>
+              <w:right w:val="single" w:color="D1D5DB" w:sz="4"/>
+            </w:tcBorders>
+            <w:tcMar>
+              <w:top w:type="dxa" w:w="70"/>
+              <w:left w:type="dxa" w:w="110"/>
+              <w:bottom w:type="dxa" w:w="70"/>
+              <w:right w:type="dxa" w:w="110"/>
+            </w:tcMar>
+          </w:tcPr>
+          <w:p>
+            <w:r>
+              <w:rPr>
+                <w:rFonts w:ascii="Calibri" w:cs="Calibri" w:eastAsia="Calibri" w:hAnsi="Calibri"/>
+                <w:sz w:val="19"/>
+                <w:szCs w:val="19"/>
+              </w:rPr>
+              <w:t xml:space="preserve">11-24 ms, median 17</w:t>
+            </w:r>
+          </w:p>
+        </w:tc>
+        <w:tc>
+          <w:tcPr>
+            <w:tcW w:type="dxa" w:w="2100"/>
+            <w:tcBorders>
+              <w:top w:val="single" w:color="D1D5DB" w:sz="4"/>
+              <w:left w:val="single" w:color="D1D5DB" w:sz="4"/>
+              <w:bottom w:val="single" w:color="D1D5DB" w:sz="4"/>
+              <w:right w:val="single" w:color="D1D5DB" w:sz="4"/>
+            </w:tcBorders>
+            <w:tcMar>
+              <w:top w:type="dxa" w:w="70"/>
+              <w:left w:type="dxa" w:w="110"/>
+              <w:bottom w:type="dxa" w:w="70"/>
+              <w:right w:type="dxa" w:w="110"/>
+            </w:tcMar>
+          </w:tcPr>
+          <w:p>
+            <w:r>
+              <w:rPr>
+                <w:rFonts w:ascii="Calibri" w:cs="Calibri" w:eastAsia="Calibri" w:hAnsi="Calibri"/>
+                <w:sz w:val="19"/>
+                <w:szCs w:val="19"/>
+              </w:rPr>
+              <w:t xml:space="preserve">unchanged</w:t>
+            </w:r>
+          </w:p>
+        </w:tc>
+      </w:tr>
+      <w:tr>
+        <w:trPr>
+          <w:cantSplit/>
+        </w:trPr>
+        <w:tc>
+          <w:tcPr>
+            <w:tcW w:type="dxa" w:w="3600"/>
+            <w:tcBorders>
+              <w:top w:val="single" w:color="D1D5DB" w:sz="4"/>
+              <w:left w:val="single" w:color="D1D5DB" w:sz="4"/>
+              <w:bottom w:val="single" w:color="D1D5DB" w:sz="4"/>
+              <w:right w:val="single" w:color="D1D5DB" w:sz="4"/>
+            </w:tcBorders>
+            <w:tcMar>
+              <w:top w:type="dxa" w:w="70"/>
+              <w:left w:type="dxa" w:w="110"/>
+              <w:bottom w:type="dxa" w:w="70"/>
+              <w:right w:type="dxa" w:w="110"/>
+            </w:tcMar>
+          </w:tcPr>
+          <w:p>
+            <w:r>
+              <w:rPr>
+                <w:rFonts w:ascii="Calibri" w:cs="Calibri" w:eastAsia="Calibri" w:hAnsi="Calibri"/>
+                <w:sz w:val="19"/>
+                <w:szCs w:val="19"/>
+              </w:rPr>
+              <w:t xml:space="preserve">Data requests per tab click</w:t>
+            </w:r>
+          </w:p>
+        </w:tc>
+        <w:tc>
+          <w:tcPr>
+            <w:tcW w:type="dxa" w:w="2100"/>
+            <w:tcBorders>
+              <w:top w:val="single" w:color="D1D5DB" w:sz="4"/>
+              <w:left w:val="single" w:color="D1D5DB" w:sz="4"/>
+              <w:bottom w:val="single" w:color="D1D5DB" w:sz="4"/>
+              <w:right w:val="single" w:color="D1D5DB" w:sz="4"/>
+            </w:tcBorders>
+            <w:tcMar>
+              <w:top w:type="dxa" w:w="70"/>
+              <w:left w:type="dxa" w:w="110"/>
+              <w:bottom w:type="dxa" w:w="70"/>
+              <w:right w:type="dxa" w:w="110"/>
+            </w:tcMar>
+          </w:tcPr>
+          <w:p>
+            <w:r>
+              <w:rPr>
+                <w:rFonts w:ascii="Calibri" w:cs="Calibri" w:eastAsia="Calibri" w:hAnsi="Calibri"/>
+                <w:sz w:val="19"/>
+                <w:szCs w:val="19"/>
+              </w:rPr>
+              <w:t xml:space="preserve">0</w:t>
+            </w:r>
+          </w:p>
+        </w:tc>
+        <w:tc>
+          <w:tcPr>
+            <w:tcW w:type="dxa" w:w="2100"/>
+            <w:tcBorders>
+              <w:top w:val="single" w:color="D1D5DB" w:sz="4"/>
+              <w:left w:val="single" w:color="D1D5DB" w:sz="4"/>
+              <w:bottom w:val="single" w:color="D1D5DB" w:sz="4"/>
+              <w:right w:val="single" w:color="D1D5DB" w:sz="4"/>
+            </w:tcBorders>
+            <w:tcMar>
+              <w:top w:type="dxa" w:w="70"/>
+              <w:left w:type="dxa" w:w="110"/>
+              <w:bottom w:type="dxa" w:w="70"/>
+              <w:right w:type="dxa" w:w="110"/>
+            </w:tcMar>
+          </w:tcPr>
+          <w:p>
+            <w:r>
+              <w:rPr>
+                <w:rFonts w:ascii="Calibri" w:cs="Calibri" w:eastAsia="Calibri" w:hAnsi="Calibri"/>
+                <w:sz w:val="19"/>
+                <w:szCs w:val="19"/>
+              </w:rPr>
+              <w:t xml:space="preserve">0</w:t>
+            </w:r>
+          </w:p>
+        </w:tc>
+        <w:tc>
+          <w:tcPr>
+            <w:tcW w:type="dxa" w:w="2100"/>
+            <w:tcBorders>
+              <w:top w:val="single" w:color="D1D5DB" w:sz="4"/>
+              <w:left w:val="single" w:color="D1D5DB" w:sz="4"/>
+              <w:bottom w:val="single" w:color="D1D5DB" w:sz="4"/>
+              <w:right w:val="single" w:color="D1D5DB" w:sz="4"/>
+            </w:tcBorders>
+            <w:tcMar>
+              <w:top w:type="dxa" w:w="70"/>
+              <w:left w:type="dxa" w:w="110"/>
+              <w:bottom w:type="dxa" w:w="70"/>
+              <w:right w:type="dxa" w:w="110"/>
+            </w:tcMar>
+          </w:tcPr>
+          <w:p>
+            <w:r>
+              <w:rPr>
+                <w:rFonts w:ascii="Calibri" w:cs="Calibri" w:eastAsia="Calibri" w:hAnsi="Calibri"/>
+                <w:sz w:val="19"/>
+                <w:szCs w:val="19"/>
+              </w:rPr>
+              <w:t xml:space="preserve">unchanged</w:t>
+            </w:r>
+          </w:p>
+        </w:tc>
+      </w:tr>
+      <w:tr>
+        <w:trPr>
+          <w:cantSplit/>
+        </w:trPr>
+        <w:tc>
+          <w:tcPr>
+            <w:tcW w:type="dxa" w:w="3600"/>
+            <w:tcBorders>
+              <w:top w:val="single" w:color="D1D5DB" w:sz="4"/>
+              <w:left w:val="single" w:color="D1D5DB" w:sz="4"/>
+              <w:bottom w:val="single" w:color="D1D5DB" w:sz="4"/>
+              <w:right w:val="single" w:color="D1D5DB" w:sz="4"/>
+            </w:tcBorders>
+            <w:tcMar>
+              <w:top w:type="dxa" w:w="70"/>
+              <w:left w:type="dxa" w:w="110"/>
+              <w:bottom w:type="dxa" w:w="70"/>
+              <w:right w:type="dxa" w:w="110"/>
+            </w:tcMar>
+          </w:tcPr>
+          <w:p>
+            <w:r>
+              <w:rPr>
+                <w:rFonts w:ascii="Calibri" w:cs="Calibri" w:eastAsia="Calibri" w:hAnsi="Calibri"/>
+                <w:sz w:val="19"/>
+                <w:szCs w:val="19"/>
+              </w:rPr>
+              <w:t xml:space="preserve">30-click burst</w:t>
+            </w:r>
+          </w:p>
+        </w:tc>
+        <w:tc>
+          <w:tcPr>
+            <w:tcW w:type="dxa" w:w="2100"/>
+            <w:tcBorders>
+              <w:top w:val="single" w:color="D1D5DB" w:sz="4"/>
+              <w:left w:val="single" w:color="D1D5DB" w:sz="4"/>
+              <w:bottom w:val="single" w:color="D1D5DB" w:sz="4"/>
+              <w:right w:val="single" w:color="D1D5DB" w:sz="4"/>
+            </w:tcBorders>
+            <w:tcMar>
+              <w:top w:type="dxa" w:w="70"/>
+              <w:left w:type="dxa" w:w="110"/>
+              <w:bottom w:type="dxa" w:w="70"/>
+              <w:right w:type="dxa" w:w="110"/>
+            </w:tcMar>
+          </w:tcPr>
+          <w:p>
+            <w:r>
+              <w:rPr>
+                <w:rFonts w:ascii="Calibri" w:cs="Calibri" w:eastAsia="Calibri" w:hAnsi="Calibri"/>
+                <w:sz w:val="19"/>
+                <w:szCs w:val="19"/>
+              </w:rPr>
+              <w:t xml:space="preserve">0 requests, 16 of 16</w:t>
+            </w:r>
+          </w:p>
+        </w:tc>
+        <w:tc>
+          <w:tcPr>
+            <w:tcW w:type="dxa" w:w="2100"/>
+            <w:tcBorders>
+              <w:top w:val="single" w:color="D1D5DB" w:sz="4"/>
+              <w:left w:val="single" w:color="D1D5DB" w:sz="4"/>
+              <w:bottom w:val="single" w:color="D1D5DB" w:sz="4"/>
+              <w:right w:val="single" w:color="D1D5DB" w:sz="4"/>
+            </w:tcBorders>
+            <w:tcMar>
+              <w:top w:type="dxa" w:w="70"/>
+              <w:left w:type="dxa" w:w="110"/>
+              <w:bottom w:type="dxa" w:w="70"/>
+              <w:right w:type="dxa" w:w="110"/>
+            </w:tcMar>
+          </w:tcPr>
+          <w:p>
+            <w:r>
+              <w:rPr>
+                <w:rFonts w:ascii="Calibri" w:cs="Calibri" w:eastAsia="Calibri" w:hAnsi="Calibri"/>
+                <w:sz w:val="19"/>
+                <w:szCs w:val="19"/>
+              </w:rPr>
+              <w:t xml:space="preserve">0 requests, 16 of 16, 0 Unknown</w:t>
+            </w:r>
+          </w:p>
+        </w:tc>
+        <w:tc>
+          <w:tcPr>
+            <w:tcW w:type="dxa" w:w="2100"/>
+            <w:tcBorders>
+              <w:top w:val="single" w:color="D1D5DB" w:sz="4"/>
+              <w:left w:val="single" w:color="D1D5DB" w:sz="4"/>
+              <w:bottom w:val="single" w:color="D1D5DB" w:sz="4"/>
+              <w:right w:val="single" w:color="D1D5DB" w:sz="4"/>
+            </w:tcBorders>
+            <w:tcMar>
+              <w:top w:type="dxa" w:w="70"/>
+              <w:left w:type="dxa" w:w="110"/>
+              <w:bottom w:type="dxa" w:w="70"/>
+              <w:right w:type="dxa" w:w="110"/>
+            </w:tcMar>
+          </w:tcPr>
+          <w:p>
+            <w:r>
+              <w:rPr>
+                <w:rFonts w:ascii="Calibri" w:cs="Calibri" w:eastAsia="Calibri" w:hAnsi="Calibri"/>
+                <w:sz w:val="19"/>
+                <w:szCs w:val="19"/>
+              </w:rPr>
+              <w:t xml:space="preserve">unchanged</w:t>
+            </w:r>
+          </w:p>
+        </w:tc>
+      </w:tr>
+      <w:tr>
+        <w:trPr>
+          <w:cantSplit/>
+        </w:trPr>
+        <w:tc>
+          <w:tcPr>
+            <w:tcW w:type="dxa" w:w="3600"/>
+            <w:tcBorders>
+              <w:top w:val="single" w:color="D1D5DB" w:sz="4"/>
+              <w:left w:val="single" w:color="D1D5DB" w:sz="4"/>
+              <w:bottom w:val="single" w:color="D1D5DB" w:sz="4"/>
+              <w:right w:val="single" w:color="D1D5DB" w:sz="4"/>
+            </w:tcBorders>
+            <w:tcMar>
+              <w:top w:type="dxa" w:w="70"/>
+              <w:left w:type="dxa" w:w="110"/>
+              <w:bottom w:type="dxa" w:w="70"/>
+              <w:right w:type="dxa" w:w="110"/>
+            </w:tcMar>
+          </w:tcPr>
+          <w:p>
+            <w:r>
+              <w:rPr>
+                <w:rFonts w:ascii="Calibri" w:cs="Calibri" w:eastAsia="Calibri" w:hAnsi="Calibri"/>
+                <w:sz w:val="19"/>
+                <w:szCs w:val="19"/>
+              </w:rPr>
+              <w:t xml:space="preserve">Page payload (decoded)</w:t>
+            </w:r>
+          </w:p>
+        </w:tc>
+        <w:tc>
+          <w:tcPr>
+            <w:tcW w:type="dxa" w:w="2100"/>
+            <w:tcBorders>
+              <w:top w:val="single" w:color="D1D5DB" w:sz="4"/>
+              <w:left w:val="single" w:color="D1D5DB" w:sz="4"/>
+              <w:bottom w:val="single" w:color="D1D5DB" w:sz="4"/>
+              <w:right w:val="single" w:color="D1D5DB" w:sz="4"/>
+            </w:tcBorders>
+            <w:tcMar>
+              <w:top w:type="dxa" w:w="70"/>
+              <w:left w:type="dxa" w:w="110"/>
+              <w:bottom w:type="dxa" w:w="70"/>
+              <w:right w:type="dxa" w:w="110"/>
+            </w:tcMar>
+          </w:tcPr>
+          <w:p>
+            <w:r>
+              <w:rPr>
+                <w:rFonts w:ascii="Calibri" w:cs="Calibri" w:eastAsia="Calibri" w:hAnsi="Calibri"/>
+                <w:sz w:val="19"/>
+                <w:szCs w:val="19"/>
+              </w:rPr>
+              <w:t xml:space="preserve">274 KB</w:t>
+            </w:r>
+          </w:p>
+        </w:tc>
+        <w:tc>
+          <w:tcPr>
+            <w:tcW w:type="dxa" w:w="2100"/>
+            <w:tcBorders>
+              <w:top w:val="single" w:color="D1D5DB" w:sz="4"/>
+              <w:left w:val="single" w:color="D1D5DB" w:sz="4"/>
+              <w:bottom w:val="single" w:color="D1D5DB" w:sz="4"/>
+              <w:right w:val="single" w:color="D1D5DB" w:sz="4"/>
+            </w:tcBorders>
+            <w:tcMar>
+              <w:top w:type="dxa" w:w="70"/>
+              <w:left w:type="dxa" w:w="110"/>
+              <w:bottom w:type="dxa" w:w="70"/>
+              <w:right w:type="dxa" w:w="110"/>
+            </w:tcMar>
+          </w:tcPr>
+          <w:p>
+            <w:r>
+              <w:rPr>
+                <w:rFonts w:ascii="Calibri" w:cs="Calibri" w:eastAsia="Calibri" w:hAnsi="Calibri"/>
+                <w:sz w:val="19"/>
+                <w:szCs w:val="19"/>
+              </w:rPr>
+              <w:t xml:space="preserve">274 KB</w:t>
+            </w:r>
+          </w:p>
+        </w:tc>
+        <w:tc>
+          <w:tcPr>
+            <w:tcW w:type="dxa" w:w="2100"/>
+            <w:tcBorders>
+              <w:top w:val="single" w:color="D1D5DB" w:sz="4"/>
+              <w:left w:val="single" w:color="D1D5DB" w:sz="4"/>
+              <w:bottom w:val="single" w:color="D1D5DB" w:sz="4"/>
+              <w:right w:val="single" w:color="D1D5DB" w:sz="4"/>
+            </w:tcBorders>
+            <w:tcMar>
+              <w:top w:type="dxa" w:w="70"/>
+              <w:left w:type="dxa" w:w="110"/>
+              <w:bottom w:type="dxa" w:w="70"/>
+              <w:right w:type="dxa" w:w="110"/>
+            </w:tcMar>
+          </w:tcPr>
+          <w:p>
+            <w:r>
+              <w:rPr>
+                <w:rFonts w:ascii="Calibri" w:cs="Calibri" w:eastAsia="Calibri" w:hAnsi="Calibri"/>
+                <w:sz w:val="19"/>
+                <w:szCs w:val="19"/>
+              </w:rPr>
+              <w:t xml:space="preserve">unchanged</w:t>
+            </w:r>
+          </w:p>
+        </w:tc>
+      </w:tr>
+    </w:tbl>
+    <w:p>
+      <w:pPr>
+        <w:spacing w:after="100"/>
+      </w:pPr>
+    </w:p>
+    <w:p>
+      <w:pPr>
+        <w:spacing w:after="110" w:line="276"/>
+      </w:pPr>
+      <w:r>
+        <w:rPr>
+          <w:rFonts w:ascii="Calibri" w:cs="Calibri" w:eastAsia="Calibri" w:hAnsi="Calibri"/>
+          <w:color w:val="1F2937"/>
+          <w:sz w:val="21"/>
+          <w:szCs w:val="21"/>
+        </w:rPr>
+        <w:t xml:space="preserve">The hard page load varies more (1.1-2.0 s) because it also loads and starts the page's JavaScript, so the server-render figure is the cleaner measure. A few first visits to a tab showed one or two new requests; they were lazy-loaded script files, not data, and revisits showed none.</w:t>
+      </w:r>
+    </w:p>
+    <w:tbl>
+      <w:tblPr>
+        <w:tblW w:type="dxa" w:w="9900"/>
+        <w:tblBorders>
+          <w:top w:val="single" w:color="auto" w:sz="4"/>
+          <w:left w:val="single" w:color="auto" w:sz="4"/>
+          <w:bottom w:val="single" w:color="auto" w:sz="4"/>
+          <w:right w:val="single" w:color="auto" w:sz="4"/>
+          <w:insideH w:val="single" w:color="auto" w:sz="4"/>
+          <w:insideV w:val="single" w:color="auto" w:sz="4"/>
+        </w:tblBorders>
+      </w:tblPr>
+      <w:tblGrid>
+        <w:gridCol w:w="9900"/>
+      </w:tblGrid>
+      <w:tr>
+        <w:tc>
+          <w:tcPr>
+            <w:tcW w:type="dxa" w:w="9900"/>
+            <w:tcBorders>
+              <w:top w:val="single" w:color="D1D5DB" w:sz="4"/>
+              <w:left w:val="single" w:color="B45309" w:sz="24"/>
+              <w:bottom w:val="single" w:color="D1D5DB" w:sz="4"/>
+              <w:right w:val="single" w:color="D1D5DB" w:sz="4"/>
+            </w:tcBorders>
+            <w:shd w:fill="FFFBEB" w:color="auto" w:val="clear"/>
+            <w:tcMar>
+              <w:top w:type="dxa" w:w="100"/>
+              <w:left w:type="dxa" w:w="180"/>
+              <w:bottom w:type="dxa" w:w="100"/>
+              <w:right w:type="dxa" w:w="160"/>
+            </w:tcMar>
+          </w:tcPr>
+          <w:p>
+            <w:pPr>
+              <w:spacing w:after="50"/>
+            </w:pPr>
+            <w:r>
+              <w:rPr>
+                <w:rFonts w:ascii="Calibri" w:cs="Calibri" w:eastAsia="Calibri" w:hAnsi="Calibri"/>
+                <w:b/>
+                <w:bCs/>
+                <w:color w:val="B45309"/>
+                <w:sz w:val="21"/>
+                <w:szCs w:val="21"/>
+              </w:rPr>
+              <w:t xml:space="preserve">Honest reading</w:t>
+            </w:r>
+          </w:p>
+          <w:p>
+            <w:pPr>
+              <w:spacing w:after="40"/>
+            </w:pPr>
+            <w:r>
+              <w:rPr>
+                <w:rFonts w:ascii="Calibri" w:cs="Calibri" w:eastAsia="Calibri" w:hAnsi="Calibri"/>
+                <w:color w:val="1F2937"/>
+                <w:sz w:val="20"/>
+                <w:szCs w:val="20"/>
+              </w:rPr>
+              <w:t xml:space="preserve">The full page load is clearly faster, which was the goal. It is not as fast as one hop would be: the session check still runs first, and the workspace request waits for it. Running them together would remove that round (about 230 ms against 380 ms on the local setup). I have not done it because it changes the sign-in flow.</w:t>
+            </w:r>
+          </w:p>
+          <w:p>
+            <w:pPr>
+              <w:spacing w:after="40"/>
+            </w:pPr>
+            <w:r>
+              <w:rPr>
+                <w:rFonts w:ascii="Calibri" w:cs="Calibri" w:eastAsia="Calibri" w:hAnsi="Calibri"/>
+                <w:color w:val="1F2937"/>
+                <w:sz w:val="20"/>
+                <w:szCs w:val="20"/>
+              </w:rPr>
+              <w:t xml:space="preserve">I cannot see the Server-Timing header or the load log line from the browser, so which loading path production used is inferred from the speed-up, not observed. Raw numbers: docs/perf-evidence/after-prod-2/after-production-2.json.</w:t>
+            </w:r>
+          </w:p>
+        </w:tc>
+      </w:tr>
+    </w:tbl>
+    <w:p>
+      <w:pPr>
+        <w:pStyle w:val="Heading1"/>
+        <w:spacing w:after="140" w:before="320"/>
+      </w:pPr>
+      <w:r>
+        <w:rPr>
+          <w:rFonts w:ascii="Calibri" w:cs="Calibri" w:eastAsia="Calibri" w:hAnsi="Calibri"/>
+          <w:b/>
+          <w:bCs/>
+          <w:color w:val="1F2937"/>
+          <w:sz w:val="32"/>
+          <w:szCs w:val="32"/>
+        </w:rPr>
+        <w:t xml:space="preserve">8. Limits and what is not done</w:t>
       </w:r>
     </w:p>
     <w:p>
@@ -6729,7 +8402,7 @@
           <w:sz w:val="21"/>
           <w:szCs w:val="21"/>
         </w:rPr>
-        <w:t xml:space="preserve">PERF-02 is partial. </w:t>
+        <w:t xml:space="preserve">PERF-02 is largely done. </w:t>
       </w:r>
       <w:r>
         <w:rPr>
@@ -6738,7 +8411,7 @@
           <w:sz w:val="21"/>
           <w:szCs w:val="21"/>
         </w:rPr>
-        <w:t xml:space="preserve">The page still makes 18 calls on a full render: per run it fetches metrics, evaluations, health and drift. The full load is still about 2.0 s on production. Health and drift are only needed in the run inspector and the Overview attention list, so a batched backend route for them is the next step, followed by one workspace endpoint to cut the three hops. Since tabs no longer re-render the page, this cost is paid once per visit (or per Refresh data), not once per click.</w:t>
+        <w:t xml:space="preserve">The second change made it so: the page makes one workspace request instead of 18 calls, in two hops instead of three, and the server render fell from 2.0 s to 0.87 s. What remains is the session check ahead of it. Inside the backend, the workspace route still runs a few database queries per run, so its work grows with the number of runs, but in one request rather than one request per call.</w:t>
       </w:r>
     </w:p>
     <w:p>
@@ -6817,7 +8490,7 @@
           <w:sz w:val="21"/>
           <w:szCs w:val="21"/>
         </w:rPr>
-        <w:t xml:space="preserve">Backend tests: new unit tests for the trackers and the batch service pass; the pre-existing DB-backed e2e suites could not run here (no database). I did not add an e2e test for the new route.</w:t>
+        <w:t xml:space="preserve">Backend tests: the whole end-to-end suite (243 tests, 18 files) passes against a real Postgres started for the purpose, including a new test that compares the workspace route with the separate routes. The first change's batch route and rate-limit changes are covered by the same run.</w:t>
       </w:r>
     </w:p>
     <w:p>
@@ -6836,7 +8509,7 @@
           <w:sz w:val="21"/>
           <w:szCs w:val="21"/>
         </w:rPr>
-        <w:t xml:space="preserve">The per-key limit stays at 120/min as before; with 18 calls per render that is about six full renders a minute per user. Raise it if you want more headroom.</w:t>
+        <w:t xml:space="preserve">The per-key limit stays at 120/min as before; a render is now about 3 calls, so roughly 40 renders a minute per user (it was about six).</w:t>
       </w:r>
     </w:p>
     <w:p>
@@ -6874,7 +8547,7 @@
           <w:sz w:val="21"/>
           <w:szCs w:val="21"/>
         </w:rPr>
-        <w:t xml:space="preserve">Not verified on production: the Retry banner under real throttling, and the per-user limit with two users. Per-call timing is not exposed; only one summary log line per load exists, and I have not read it from the hosting logs.</w:t>
+        <w:t xml:space="preserve">Not verified on production: the Retry banner under real throttling, and the per-user limit with two users. The Server-Timing header and the load log line exist but I cannot read them from the browser, so they have not been looked at yet.</w:t>
       </w:r>
     </w:p>
     <w:p>
@@ -6891,7 +8564,7 @@
           <w:sz w:val="32"/>
           <w:szCs w:val="32"/>
         </w:rPr>
-        <w:t xml:space="preserve">7. Success criteria and result</w:t>
+        <w:t xml:space="preserve">9. Success criteria and result</w:t>
       </w:r>
     </w:p>
     <w:p>
@@ -7278,11 +8951,11 @@
                 <w:rFonts w:ascii="Calibri" w:cs="Calibri" w:eastAsia="Calibri" w:hAnsi="Calibri"/>
                 <w:b/>
                 <w:bCs/>
-                <w:color w:val="B45309"/>
-                <w:sz w:val="19"/>
-                <w:szCs w:val="19"/>
-              </w:rPr>
-              <w:t xml:space="preserve">Partly: about 2.0 s, same as before; log line not read from the host</w:t>
+                <w:color w:val="15803D"/>
+                <w:sz w:val="19"/>
+                <w:szCs w:val="19"/>
+              </w:rPr>
+              <w:t xml:space="preserve">Pass: faster (server render 871 ms against 2015 ms); the log line itself has not been read from the host</w:t>
             </w:r>
           </w:p>
         </w:tc>
@@ -7404,7 +9077,7 @@
           <w:sz w:val="21"/>
           <w:szCs w:val="21"/>
         </w:rPr>
-        <w:t xml:space="preserve">a batched health and drift route for all runs, then one workspace endpoint, to bring the 2 s full load down; and optionally removing the duplicate source text. Neither is started.</w:t>
+        <w:t xml:space="preserve">run the session check and the workspace request together, which would remove the last extra round; read the Server-Timing log line to see where the remaining time goes; and optionally remove the duplicate source text from the manifests. None is started.</w:t>
       </w:r>
     </w:p>
     <w:sectPr>

</xml_diff>

<commit_message>
docs(perf): record the third production re-check (session check in parallel)
Update the notebook and the before/after report with the production results
after e9076bc: the change cut the page load from ~380 to ~240 ms on the local
real-backend setup but made no measurable difference on production (server
render median 889 ms over 16 fetches against 871 ms; hard loads 1.06-1.2 s;
tab clicks and the click burst unchanged). The remaining time is most likely
inside the backend request; the Server-Timing logs have not been read yet.
</commit_message>
<xml_diff>
--- a/docs/SynthGraph-Performance-Before-After-Report-Production.docx
+++ b/docs/SynthGraph-Performance-Before-After-Report-Production.docx
@@ -45,7 +45,7 @@
           <w:sz w:val="21"/>
           <w:szCs w:val="21"/>
         </w:rPr>
-        <w:t xml:space="preserve">Observed on production, fixed in two deploys (379c83c: tab clicks and rate limiting; 1b1eb67: one workspace request), and re-measured on production after each with the same script. Local comparisons cover the failure cases that should not be provoked on the live site.</w:t>
+        <w:t xml:space="preserve">Observed on production, fixed in three deploys (379c83c: tab clicks and rate limiting; 1b1eb67: one workspace request; e9076bc: session check in parallel), and re-measured on production after each with the same script. Local comparisons cover the failure cases that should not be provoked on the live site.</w:t>
       </w:r>
     </w:p>
     <w:tbl>
@@ -136,7 +136,21 @@
                 <w:sz w:val="20"/>
                 <w:szCs w:val="20"/>
               </w:rPr>
-              <w:t xml:space="preserve">After the first deploy a full page load was still about 2.0 s, because the three sequential backend hops were unchanged. The second deploy loads the whole workspace in one backend request: the server render fell from 2015 ms to a median of 871 ms, and Refresh data from 2.1 s to 1.3 s. A hard page load is about 1.6 s (median of three, range 1.1-2.0 s).</w:t>
+              <w:t xml:space="preserve">After the first deploy a full page load was still about 2.0 s, because the three sequential backend hops were unchanged. The second deploy loads the whole workspace in one backend request: the server render fell from 2015 ms to a median of 871 ms, and Refresh data from 2.1 s to 1.3 s. A hard page load is about 1.1-1.6 s.</w:t>
+            </w:r>
+          </w:p>
+          <w:p>
+            <w:pPr>
+              <w:spacing w:after="40"/>
+            </w:pPr>
+            <w:r>
+              <w:rPr>
+                <w:rFonts w:ascii="Calibri" w:cs="Calibri" w:eastAsia="Calibri" w:hAnsi="Calibri"/>
+                <w:color w:val="1F2937"/>
+                <w:sz w:val="20"/>
+                <w:szCs w:val="20"/>
+              </w:rPr>
+              <w:t xml:space="preserve">A third change, starting the session check and the workspace request together, cut the load from about 380 to about 240 ms on a local setup but made no measurable difference on production (server render median 889 ms over 16 fetches, against 871 ms). The remaining 0.85 s is probably inside the backend request.</w:t>
             </w:r>
           </w:p>
           <w:p>
@@ -213,7 +227,7 @@
           <w:sz w:val="21"/>
           <w:szCs w:val="21"/>
         </w:rPr>
-        <w:t xml:space="preserve">Implemented the fixes on a new branch from origin/main and committed them (379c83c). You merged and deployed it. After the first production re-check the full page load was still about 2 s, so I added a second change (1b1eb67: batched health and drift, one workspace endpoint, timing), which you also merged and deployed.</w:t>
+        <w:t xml:space="preserve">Implemented the fixes on a new branch from origin/main and committed them (379c83c). You merged and deployed it. After the first production re-check the full page load was still about 2 s, so I added a second change (1b1eb67: batched health and drift, one workspace endpoint, timing), which you also merged and deployed. A third (e9076bc) started the session check and the workspace request together.</w:t>
       </w:r>
     </w:p>
     <w:p>
@@ -8328,7 +8342,7 @@
                 <w:sz w:val="20"/>
                 <w:szCs w:val="20"/>
               </w:rPr>
-              <w:t xml:space="preserve">The full page load is clearly faster, which was the goal. It is not as fast as one hop would be: the session check still runs first, and the workspace request waits for it. Running them together would remove that round (about 230 ms against 380 ms on the local setup). I have not done it because it changes the sign-in flow.</w:t>
+              <w:t xml:space="preserve">The full page load is clearly faster, which was the goal. At this point the session check still ran first and the workspace request waited for it; the third change (section 8) removed that wait.</w:t>
             </w:r>
           </w:p>
           <w:p>
@@ -8362,7 +8376,1384 @@
           <w:sz w:val="32"/>
           <w:szCs w:val="32"/>
         </w:rPr>
-        <w:t xml:space="preserve">8. Limits and what is not done</w:t>
+        <w:t xml:space="preserve">8. The third change: session check and workspace request together</w:t>
+      </w:r>
+    </w:p>
+    <w:p>
+      <w:pPr>
+        <w:spacing w:after="110" w:line="276"/>
+      </w:pPr>
+      <w:r>
+        <w:rPr>
+          <w:rFonts w:ascii="Calibri" w:cs="Calibri" w:eastAsia="Calibri" w:hAnsi="Calibri"/>
+          <w:color w:val="1F2937"/>
+          <w:sz w:val="21"/>
+          <w:szCs w:val="21"/>
+        </w:rPr>
+        <w:t xml:space="preserve">The page asked for its data only after the session check had answered, and its title made a second experiment lookup after that. The change sends the workspace request with the cookie's key at once, beside the session check (the backend checks the key itself, and the data is used only once the session is accepted), and takes the page title from the same request. A rejected key now makes four backend calls instead of two; nothing else about the redirects changed.</w:t>
+      </w:r>
+    </w:p>
+    <w:p>
+      <w:pPr>
+        <w:pStyle w:val="Heading2"/>
+        <w:keepNext/>
+        <w:spacing w:after="100" w:before="240"/>
+      </w:pPr>
+      <w:r>
+        <w:rPr>
+          <w:rFonts w:ascii="Calibri" w:cs="Calibri" w:eastAsia="Calibri" w:hAnsi="Calibri"/>
+          <w:b/>
+          <w:bCs/>
+          <w:color w:val="1D4ED8"/>
+          <w:sz w:val="26"/>
+          <w:szCs w:val="26"/>
+        </w:rPr>
+        <w:t xml:space="preserve">Locally: a real gain</w:t>
+      </w:r>
+    </w:p>
+    <w:tbl>
+      <w:tblPr>
+        <w:tblW w:type="dxa" w:w="9900"/>
+        <w:tblBorders>
+          <w:top w:val="single" w:color="auto" w:sz="4"/>
+          <w:left w:val="single" w:color="auto" w:sz="4"/>
+          <w:bottom w:val="single" w:color="auto" w:sz="4"/>
+          <w:right w:val="single" w:color="auto" w:sz="4"/>
+          <w:insideH w:val="single" w:color="auto" w:sz="4"/>
+          <w:insideV w:val="single" w:color="auto" w:sz="4"/>
+        </w:tblBorders>
+      </w:tblPr>
+      <w:tblGrid>
+        <w:gridCol w:w="3900"/>
+        <w:gridCol w:w="1900"/>
+        <w:gridCol w:w="1900"/>
+        <w:gridCol w:w="2200"/>
+      </w:tblGrid>
+      <w:tr>
+        <w:trPr>
+          <w:tblHeader/>
+        </w:trPr>
+        <w:tc>
+          <w:tcPr>
+            <w:tcW w:type="dxa" w:w="3900"/>
+            <w:tcBorders>
+              <w:top w:val="single" w:color="D1D5DB" w:sz="4"/>
+              <w:left w:val="single" w:color="D1D5DB" w:sz="4"/>
+              <w:bottom w:val="single" w:color="D1D5DB" w:sz="4"/>
+              <w:right w:val="single" w:color="D1D5DB" w:sz="4"/>
+            </w:tcBorders>
+            <w:shd w:fill="E5E7EB" w:color="auto" w:val="clear"/>
+            <w:tcMar>
+              <w:top w:type="dxa" w:w="70"/>
+              <w:left w:type="dxa" w:w="110"/>
+              <w:bottom w:type="dxa" w:w="70"/>
+              <w:right w:type="dxa" w:w="110"/>
+            </w:tcMar>
+          </w:tcPr>
+          <w:p>
+            <w:r>
+              <w:rPr>
+                <w:rFonts w:ascii="Calibri" w:cs="Calibri" w:eastAsia="Calibri" w:hAnsi="Calibri"/>
+                <w:b/>
+                <w:bCs/>
+                <w:sz w:val="19"/>
+                <w:szCs w:val="19"/>
+              </w:rPr>
+              <w:t xml:space="preserve">Same local setup as section 6</w:t>
+            </w:r>
+          </w:p>
+        </w:tc>
+        <w:tc>
+          <w:tcPr>
+            <w:tcW w:type="dxa" w:w="1900"/>
+            <w:tcBorders>
+              <w:top w:val="single" w:color="D1D5DB" w:sz="4"/>
+              <w:left w:val="single" w:color="D1D5DB" w:sz="4"/>
+              <w:bottom w:val="single" w:color="D1D5DB" w:sz="4"/>
+              <w:right w:val="single" w:color="D1D5DB" w:sz="4"/>
+            </w:tcBorders>
+            <w:shd w:fill="E5E7EB" w:color="auto" w:val="clear"/>
+            <w:tcMar>
+              <w:top w:type="dxa" w:w="70"/>
+              <w:left w:type="dxa" w:w="110"/>
+              <w:bottom w:type="dxa" w:w="70"/>
+              <w:right w:type="dxa" w:w="110"/>
+            </w:tcMar>
+          </w:tcPr>
+          <w:p>
+            <w:r>
+              <w:rPr>
+                <w:rFonts w:ascii="Calibri" w:cs="Calibri" w:eastAsia="Calibri" w:hAnsi="Calibri"/>
+                <w:b/>
+                <w:bCs/>
+                <w:sz w:val="19"/>
+                <w:szCs w:val="19"/>
+              </w:rPr>
+              <w:t xml:space="preserve">Page load</w:t>
+            </w:r>
+          </w:p>
+        </w:tc>
+        <w:tc>
+          <w:tcPr>
+            <w:tcW w:type="dxa" w:w="1900"/>
+            <w:tcBorders>
+              <w:top w:val="single" w:color="D1D5DB" w:sz="4"/>
+              <w:left w:val="single" w:color="D1D5DB" w:sz="4"/>
+              <w:bottom w:val="single" w:color="D1D5DB" w:sz="4"/>
+              <w:right w:val="single" w:color="D1D5DB" w:sz="4"/>
+            </w:tcBorders>
+            <w:shd w:fill="E5E7EB" w:color="auto" w:val="clear"/>
+            <w:tcMar>
+              <w:top w:type="dxa" w:w="70"/>
+              <w:left w:type="dxa" w:w="110"/>
+              <w:bottom w:type="dxa" w:w="70"/>
+              <w:right w:type="dxa" w:w="110"/>
+            </w:tcMar>
+          </w:tcPr>
+          <w:p>
+            <w:r>
+              <w:rPr>
+                <w:rFonts w:ascii="Calibri" w:cs="Calibri" w:eastAsia="Calibri" w:hAnsi="Calibri"/>
+                <w:b/>
+                <w:bCs/>
+                <w:sz w:val="19"/>
+                <w:szCs w:val="19"/>
+              </w:rPr>
+              <w:t xml:space="preserve">Backend calls</w:t>
+            </w:r>
+          </w:p>
+        </w:tc>
+        <w:tc>
+          <w:tcPr>
+            <w:tcW w:type="dxa" w:w="2200"/>
+            <w:tcBorders>
+              <w:top w:val="single" w:color="D1D5DB" w:sz="4"/>
+              <w:left w:val="single" w:color="D1D5DB" w:sz="4"/>
+              <w:bottom w:val="single" w:color="D1D5DB" w:sz="4"/>
+              <w:right w:val="single" w:color="D1D5DB" w:sz="4"/>
+            </w:tcBorders>
+            <w:shd w:fill="E5E7EB" w:color="auto" w:val="clear"/>
+            <w:tcMar>
+              <w:top w:type="dxa" w:w="70"/>
+              <w:left w:type="dxa" w:w="110"/>
+              <w:bottom w:type="dxa" w:w="70"/>
+              <w:right w:type="dxa" w:w="110"/>
+            </w:tcMar>
+          </w:tcPr>
+          <w:p>
+            <w:r>
+              <w:rPr>
+                <w:rFonts w:ascii="Calibri" w:cs="Calibri" w:eastAsia="Calibri" w:hAnsi="Calibri"/>
+                <w:b/>
+                <w:bCs/>
+                <w:sz w:val="19"/>
+                <w:szCs w:val="19"/>
+              </w:rPr>
+              <w:t xml:space="preserve">Round trips deep</w:t>
+            </w:r>
+          </w:p>
+        </w:tc>
+      </w:tr>
+      <w:tr>
+        <w:trPr>
+          <w:cantSplit/>
+        </w:trPr>
+        <w:tc>
+          <w:tcPr>
+            <w:tcW w:type="dxa" w:w="3900"/>
+            <w:tcBorders>
+              <w:top w:val="single" w:color="D1D5DB" w:sz="4"/>
+              <w:left w:val="single" w:color="D1D5DB" w:sz="4"/>
+              <w:bottom w:val="single" w:color="D1D5DB" w:sz="4"/>
+              <w:right w:val="single" w:color="D1D5DB" w:sz="4"/>
+            </w:tcBorders>
+            <w:tcMar>
+              <w:top w:type="dxa" w:w="70"/>
+              <w:left w:type="dxa" w:w="110"/>
+              <w:bottom w:type="dxa" w:w="70"/>
+              <w:right w:type="dxa" w:w="110"/>
+            </w:tcMar>
+          </w:tcPr>
+          <w:p>
+            <w:r>
+              <w:rPr>
+                <w:rFonts w:ascii="Calibri" w:cs="Calibri" w:eastAsia="Calibri" w:hAnsi="Calibri"/>
+                <w:sz w:val="19"/>
+                <w:szCs w:val="19"/>
+              </w:rPr>
+              <w:t xml:space="preserve">Before this change</w:t>
+            </w:r>
+          </w:p>
+        </w:tc>
+        <w:tc>
+          <w:tcPr>
+            <w:tcW w:type="dxa" w:w="1900"/>
+            <w:tcBorders>
+              <w:top w:val="single" w:color="D1D5DB" w:sz="4"/>
+              <w:left w:val="single" w:color="D1D5DB" w:sz="4"/>
+              <w:bottom w:val="single" w:color="D1D5DB" w:sz="4"/>
+              <w:right w:val="single" w:color="D1D5DB" w:sz="4"/>
+            </w:tcBorders>
+            <w:tcMar>
+              <w:top w:type="dxa" w:w="70"/>
+              <w:left w:type="dxa" w:w="110"/>
+              <w:bottom w:type="dxa" w:w="70"/>
+              <w:right w:type="dxa" w:w="110"/>
+            </w:tcMar>
+          </w:tcPr>
+          <w:p>
+            <w:r>
+              <w:rPr>
+                <w:rFonts w:ascii="Calibri" w:cs="Calibri" w:eastAsia="Calibri" w:hAnsi="Calibri"/>
+                <w:sz w:val="19"/>
+                <w:szCs w:val="19"/>
+              </w:rPr>
+              <w:t xml:space="preserve">372-402 ms</w:t>
+            </w:r>
+          </w:p>
+        </w:tc>
+        <w:tc>
+          <w:tcPr>
+            <w:tcW w:type="dxa" w:w="1900"/>
+            <w:tcBorders>
+              <w:top w:val="single" w:color="D1D5DB" w:sz="4"/>
+              <w:left w:val="single" w:color="D1D5DB" w:sz="4"/>
+              <w:bottom w:val="single" w:color="D1D5DB" w:sz="4"/>
+              <w:right w:val="single" w:color="D1D5DB" w:sz="4"/>
+            </w:tcBorders>
+            <w:tcMar>
+              <w:top w:type="dxa" w:w="70"/>
+              <w:left w:type="dxa" w:w="110"/>
+              <w:bottom w:type="dxa" w:w="70"/>
+              <w:right w:type="dxa" w:w="110"/>
+            </w:tcMar>
+          </w:tcPr>
+          <w:p>
+            <w:r>
+              <w:rPr>
+                <w:rFonts w:ascii="Calibri" w:cs="Calibri" w:eastAsia="Calibri" w:hAnsi="Calibri"/>
+                <w:sz w:val="19"/>
+                <w:szCs w:val="19"/>
+              </w:rPr>
+              <w:t xml:space="preserve">3</w:t>
+            </w:r>
+          </w:p>
+        </w:tc>
+        <w:tc>
+          <w:tcPr>
+            <w:tcW w:type="dxa" w:w="2200"/>
+            <w:tcBorders>
+              <w:top w:val="single" w:color="D1D5DB" w:sz="4"/>
+              <w:left w:val="single" w:color="D1D5DB" w:sz="4"/>
+              <w:bottom w:val="single" w:color="D1D5DB" w:sz="4"/>
+              <w:right w:val="single" w:color="D1D5DB" w:sz="4"/>
+            </w:tcBorders>
+            <w:tcMar>
+              <w:top w:type="dxa" w:w="70"/>
+              <w:left w:type="dxa" w:w="110"/>
+              <w:bottom w:type="dxa" w:w="70"/>
+              <w:right w:type="dxa" w:w="110"/>
+            </w:tcMar>
+          </w:tcPr>
+          <w:p>
+            <w:r>
+              <w:rPr>
+                <w:rFonts w:ascii="Calibri" w:cs="Calibri" w:eastAsia="Calibri" w:hAnsi="Calibri"/>
+                <w:sz w:val="19"/>
+                <w:szCs w:val="19"/>
+              </w:rPr>
+              <w:t xml:space="preserve">2</w:t>
+            </w:r>
+          </w:p>
+        </w:tc>
+      </w:tr>
+      <w:tr>
+        <w:trPr>
+          <w:cantSplit/>
+        </w:trPr>
+        <w:tc>
+          <w:tcPr>
+            <w:tcW w:type="dxa" w:w="3900"/>
+            <w:tcBorders>
+              <w:top w:val="single" w:color="D1D5DB" w:sz="4"/>
+              <w:left w:val="single" w:color="D1D5DB" w:sz="4"/>
+              <w:bottom w:val="single" w:color="D1D5DB" w:sz="4"/>
+              <w:right w:val="single" w:color="D1D5DB" w:sz="4"/>
+            </w:tcBorders>
+            <w:tcMar>
+              <w:top w:type="dxa" w:w="70"/>
+              <w:left w:type="dxa" w:w="110"/>
+              <w:bottom w:type="dxa" w:w="70"/>
+              <w:right w:type="dxa" w:w="110"/>
+            </w:tcMar>
+          </w:tcPr>
+          <w:p>
+            <w:r>
+              <w:rPr>
+                <w:rFonts w:ascii="Calibri" w:cs="Calibri" w:eastAsia="Calibri" w:hAnsi="Calibri"/>
+                <w:sz w:val="19"/>
+                <w:szCs w:val="19"/>
+              </w:rPr>
+              <w:t xml:space="preserve">Session and workspace together, title still separate</w:t>
+            </w:r>
+          </w:p>
+        </w:tc>
+        <w:tc>
+          <w:tcPr>
+            <w:tcW w:type="dxa" w:w="1900"/>
+            <w:tcBorders>
+              <w:top w:val="single" w:color="D1D5DB" w:sz="4"/>
+              <w:left w:val="single" w:color="D1D5DB" w:sz="4"/>
+              <w:bottom w:val="single" w:color="D1D5DB" w:sz="4"/>
+              <w:right w:val="single" w:color="D1D5DB" w:sz="4"/>
+            </w:tcBorders>
+            <w:tcMar>
+              <w:top w:type="dxa" w:w="70"/>
+              <w:left w:type="dxa" w:w="110"/>
+              <w:bottom w:type="dxa" w:w="70"/>
+              <w:right w:type="dxa" w:w="110"/>
+            </w:tcMar>
+          </w:tcPr>
+          <w:p>
+            <w:r>
+              <w:rPr>
+                <w:rFonts w:ascii="Calibri" w:cs="Calibri" w:eastAsia="Calibri" w:hAnsi="Calibri"/>
+                <w:sz w:val="19"/>
+                <w:szCs w:val="19"/>
+              </w:rPr>
+              <w:t xml:space="preserve">342-359 ms</w:t>
+            </w:r>
+          </w:p>
+        </w:tc>
+        <w:tc>
+          <w:tcPr>
+            <w:tcW w:type="dxa" w:w="1900"/>
+            <w:tcBorders>
+              <w:top w:val="single" w:color="D1D5DB" w:sz="4"/>
+              <w:left w:val="single" w:color="D1D5DB" w:sz="4"/>
+              <w:bottom w:val="single" w:color="D1D5DB" w:sz="4"/>
+              <w:right w:val="single" w:color="D1D5DB" w:sz="4"/>
+            </w:tcBorders>
+            <w:tcMar>
+              <w:top w:type="dxa" w:w="70"/>
+              <w:left w:type="dxa" w:w="110"/>
+              <w:bottom w:type="dxa" w:w="70"/>
+              <w:right w:type="dxa" w:w="110"/>
+            </w:tcMar>
+          </w:tcPr>
+          <w:p>
+            <w:r>
+              <w:rPr>
+                <w:rFonts w:ascii="Calibri" w:cs="Calibri" w:eastAsia="Calibri" w:hAnsi="Calibri"/>
+                <w:sz w:val="19"/>
+                <w:szCs w:val="19"/>
+              </w:rPr>
+              <w:t xml:space="preserve">3</w:t>
+            </w:r>
+          </w:p>
+        </w:tc>
+        <w:tc>
+          <w:tcPr>
+            <w:tcW w:type="dxa" w:w="2200"/>
+            <w:tcBorders>
+              <w:top w:val="single" w:color="D1D5DB" w:sz="4"/>
+              <w:left w:val="single" w:color="D1D5DB" w:sz="4"/>
+              <w:bottom w:val="single" w:color="D1D5DB" w:sz="4"/>
+              <w:right w:val="single" w:color="D1D5DB" w:sz="4"/>
+            </w:tcBorders>
+            <w:tcMar>
+              <w:top w:type="dxa" w:w="70"/>
+              <w:left w:type="dxa" w:w="110"/>
+              <w:bottom w:type="dxa" w:w="70"/>
+              <w:right w:type="dxa" w:w="110"/>
+            </w:tcMar>
+          </w:tcPr>
+          <w:p>
+            <w:r>
+              <w:rPr>
+                <w:rFonts w:ascii="Calibri" w:cs="Calibri" w:eastAsia="Calibri" w:hAnsi="Calibri"/>
+                <w:sz w:val="19"/>
+                <w:szCs w:val="19"/>
+              </w:rPr>
+              <w:t xml:space="preserve">2</w:t>
+            </w:r>
+          </w:p>
+        </w:tc>
+      </w:tr>
+      <w:tr>
+        <w:trPr>
+          <w:cantSplit/>
+        </w:trPr>
+        <w:tc>
+          <w:tcPr>
+            <w:tcW w:type="dxa" w:w="3900"/>
+            <w:tcBorders>
+              <w:top w:val="single" w:color="D1D5DB" w:sz="4"/>
+              <w:left w:val="single" w:color="D1D5DB" w:sz="4"/>
+              <w:bottom w:val="single" w:color="D1D5DB" w:sz="4"/>
+              <w:right w:val="single" w:color="D1D5DB" w:sz="4"/>
+            </w:tcBorders>
+            <w:tcMar>
+              <w:top w:type="dxa" w:w="70"/>
+              <w:left w:type="dxa" w:w="110"/>
+              <w:bottom w:type="dxa" w:w="70"/>
+              <w:right w:type="dxa" w:w="110"/>
+            </w:tcMar>
+          </w:tcPr>
+          <w:p>
+            <w:r>
+              <w:rPr>
+                <w:rFonts w:ascii="Calibri" w:cs="Calibri" w:eastAsia="Calibri" w:hAnsi="Calibri"/>
+                <w:b/>
+                <w:bCs/>
+                <w:sz w:val="19"/>
+                <w:szCs w:val="19"/>
+              </w:rPr>
+              <w:t xml:space="preserve">Plus the title sharing the workspace request</w:t>
+            </w:r>
+          </w:p>
+        </w:tc>
+        <w:tc>
+          <w:tcPr>
+            <w:tcW w:type="dxa" w:w="1900"/>
+            <w:tcBorders>
+              <w:top w:val="single" w:color="D1D5DB" w:sz="4"/>
+              <w:left w:val="single" w:color="D1D5DB" w:sz="4"/>
+              <w:bottom w:val="single" w:color="D1D5DB" w:sz="4"/>
+              <w:right w:val="single" w:color="D1D5DB" w:sz="4"/>
+            </w:tcBorders>
+            <w:tcMar>
+              <w:top w:type="dxa" w:w="70"/>
+              <w:left w:type="dxa" w:w="110"/>
+              <w:bottom w:type="dxa" w:w="70"/>
+              <w:right w:type="dxa" w:w="110"/>
+            </w:tcMar>
+          </w:tcPr>
+          <w:p>
+            <w:r>
+              <w:rPr>
+                <w:rFonts w:ascii="Calibri" w:cs="Calibri" w:eastAsia="Calibri" w:hAnsi="Calibri"/>
+                <w:b/>
+                <w:bCs/>
+                <w:color w:val="15803D"/>
+                <w:sz w:val="19"/>
+                <w:szCs w:val="19"/>
+              </w:rPr>
+              <w:t xml:space="preserve">228-250 ms</w:t>
+            </w:r>
+          </w:p>
+        </w:tc>
+        <w:tc>
+          <w:tcPr>
+            <w:tcW w:type="dxa" w:w="1900"/>
+            <w:tcBorders>
+              <w:top w:val="single" w:color="D1D5DB" w:sz="4"/>
+              <w:left w:val="single" w:color="D1D5DB" w:sz="4"/>
+              <w:bottom w:val="single" w:color="D1D5DB" w:sz="4"/>
+              <w:right w:val="single" w:color="D1D5DB" w:sz="4"/>
+            </w:tcBorders>
+            <w:tcMar>
+              <w:top w:type="dxa" w:w="70"/>
+              <w:left w:type="dxa" w:w="110"/>
+              <w:bottom w:type="dxa" w:w="70"/>
+              <w:right w:type="dxa" w:w="110"/>
+            </w:tcMar>
+          </w:tcPr>
+          <w:p>
+            <w:r>
+              <w:rPr>
+                <w:rFonts w:ascii="Calibri" w:cs="Calibri" w:eastAsia="Calibri" w:hAnsi="Calibri"/>
+                <w:b/>
+                <w:bCs/>
+                <w:color w:val="15803D"/>
+                <w:sz w:val="19"/>
+                <w:szCs w:val="19"/>
+              </w:rPr>
+              <w:t xml:space="preserve">2</w:t>
+            </w:r>
+          </w:p>
+        </w:tc>
+        <w:tc>
+          <w:tcPr>
+            <w:tcW w:type="dxa" w:w="2200"/>
+            <w:tcBorders>
+              <w:top w:val="single" w:color="D1D5DB" w:sz="4"/>
+              <w:left w:val="single" w:color="D1D5DB" w:sz="4"/>
+              <w:bottom w:val="single" w:color="D1D5DB" w:sz="4"/>
+              <w:right w:val="single" w:color="D1D5DB" w:sz="4"/>
+            </w:tcBorders>
+            <w:tcMar>
+              <w:top w:type="dxa" w:w="70"/>
+              <w:left w:type="dxa" w:w="110"/>
+              <w:bottom w:type="dxa" w:w="70"/>
+              <w:right w:type="dxa" w:w="110"/>
+            </w:tcMar>
+          </w:tcPr>
+          <w:p>
+            <w:r>
+              <w:rPr>
+                <w:rFonts w:ascii="Calibri" w:cs="Calibri" w:eastAsia="Calibri" w:hAnsi="Calibri"/>
+                <w:b/>
+                <w:bCs/>
+                <w:color w:val="15803D"/>
+                <w:sz w:val="19"/>
+                <w:szCs w:val="19"/>
+              </w:rPr>
+              <w:t xml:space="preserve">1</w:t>
+            </w:r>
+          </w:p>
+        </w:tc>
+      </w:tr>
+    </w:tbl>
+    <w:p>
+      <w:pPr>
+        <w:spacing w:after="100"/>
+      </w:pPr>
+    </w:p>
+    <w:p>
+      <w:pPr>
+        <w:spacing w:after="110" w:line="276"/>
+      </w:pPr>
+      <w:r>
+        <w:rPr>
+          <w:rFonts w:ascii="Calibri" w:cs="Calibri" w:eastAsia="Calibri" w:hAnsi="Calibri"/>
+          <w:color w:val="1F2937"/>
+          <w:sz w:val="21"/>
+          <w:szCs w:val="21"/>
+        </w:rPr>
+        <w:t xml:space="preserve">Starting the two requests together alone saved only about 30 ms, because the title lookup then became the longest path. The data in the page is unchanged: both versions stream 637 rows with the same content, differing only in the build id and in where one long string is split across stream chunks.</w:t>
+      </w:r>
+    </w:p>
+    <w:p>
+      <w:pPr>
+        <w:pStyle w:val="Heading2"/>
+        <w:keepNext/>
+        <w:spacing w:after="100" w:before="240"/>
+      </w:pPr>
+      <w:r>
+        <w:rPr>
+          <w:rFonts w:ascii="Calibri" w:cs="Calibri" w:eastAsia="Calibri" w:hAnsi="Calibri"/>
+          <w:b/>
+          <w:bCs/>
+          <w:color w:val="1D4ED8"/>
+          <w:sz w:val="26"/>
+          <w:szCs w:val="26"/>
+        </w:rPr>
+        <w:t xml:space="preserve">On production: no measurable change</w:t>
+      </w:r>
+    </w:p>
+    <w:tbl>
+      <w:tblPr>
+        <w:tblW w:type="dxa" w:w="9900"/>
+        <w:tblBorders>
+          <w:top w:val="single" w:color="auto" w:sz="4"/>
+          <w:left w:val="single" w:color="auto" w:sz="4"/>
+          <w:bottom w:val="single" w:color="auto" w:sz="4"/>
+          <w:right w:val="single" w:color="auto" w:sz="4"/>
+          <w:insideH w:val="single" w:color="auto" w:sz="4"/>
+          <w:insideV w:val="single" w:color="auto" w:sz="4"/>
+        </w:tblBorders>
+      </w:tblPr>
+      <w:tblGrid>
+        <w:gridCol w:w="3600"/>
+        <w:gridCol w:w="2100"/>
+        <w:gridCol w:w="2100"/>
+        <w:gridCol w:w="2100"/>
+      </w:tblGrid>
+      <w:tr>
+        <w:trPr>
+          <w:tblHeader/>
+        </w:trPr>
+        <w:tc>
+          <w:tcPr>
+            <w:tcW w:type="dxa" w:w="3600"/>
+            <w:tcBorders>
+              <w:top w:val="single" w:color="D1D5DB" w:sz="4"/>
+              <w:left w:val="single" w:color="D1D5DB" w:sz="4"/>
+              <w:bottom w:val="single" w:color="D1D5DB" w:sz="4"/>
+              <w:right w:val="single" w:color="D1D5DB" w:sz="4"/>
+            </w:tcBorders>
+            <w:shd w:fill="E5E7EB" w:color="auto" w:val="clear"/>
+            <w:tcMar>
+              <w:top w:type="dxa" w:w="70"/>
+              <w:left w:type="dxa" w:w="110"/>
+              <w:bottom w:type="dxa" w:w="70"/>
+              <w:right w:type="dxa" w:w="110"/>
+            </w:tcMar>
+          </w:tcPr>
+          <w:p>
+            <w:r>
+              <w:rPr>
+                <w:rFonts w:ascii="Calibri" w:cs="Calibri" w:eastAsia="Calibri" w:hAnsi="Calibri"/>
+                <w:b/>
+                <w:bCs/>
+                <w:sz w:val="19"/>
+                <w:szCs w:val="19"/>
+              </w:rPr>
+              <w:t xml:space="preserve">Measure</w:t>
+            </w:r>
+          </w:p>
+        </w:tc>
+        <w:tc>
+          <w:tcPr>
+            <w:tcW w:type="dxa" w:w="2100"/>
+            <w:tcBorders>
+              <w:top w:val="single" w:color="D1D5DB" w:sz="4"/>
+              <w:left w:val="single" w:color="D1D5DB" w:sz="4"/>
+              <w:bottom w:val="single" w:color="D1D5DB" w:sz="4"/>
+              <w:right w:val="single" w:color="D1D5DB" w:sz="4"/>
+            </w:tcBorders>
+            <w:shd w:fill="E5E7EB" w:color="auto" w:val="clear"/>
+            <w:tcMar>
+              <w:top w:type="dxa" w:w="70"/>
+              <w:left w:type="dxa" w:w="110"/>
+              <w:bottom w:type="dxa" w:w="70"/>
+              <w:right w:type="dxa" w:w="110"/>
+            </w:tcMar>
+          </w:tcPr>
+          <w:p>
+            <w:r>
+              <w:rPr>
+                <w:rFonts w:ascii="Calibri" w:cs="Calibri" w:eastAsia="Calibri" w:hAnsi="Calibri"/>
+                <w:b/>
+                <w:bCs/>
+                <w:sz w:val="19"/>
+                <w:szCs w:val="19"/>
+              </w:rPr>
+              <w:t xml:space="preserve">Before this change</w:t>
+            </w:r>
+          </w:p>
+        </w:tc>
+        <w:tc>
+          <w:tcPr>
+            <w:tcW w:type="dxa" w:w="2100"/>
+            <w:tcBorders>
+              <w:top w:val="single" w:color="D1D5DB" w:sz="4"/>
+              <w:left w:val="single" w:color="D1D5DB" w:sz="4"/>
+              <w:bottom w:val="single" w:color="D1D5DB" w:sz="4"/>
+              <w:right w:val="single" w:color="D1D5DB" w:sz="4"/>
+            </w:tcBorders>
+            <w:shd w:fill="E5E7EB" w:color="auto" w:val="clear"/>
+            <w:tcMar>
+              <w:top w:type="dxa" w:w="70"/>
+              <w:left w:type="dxa" w:w="110"/>
+              <w:bottom w:type="dxa" w:w="70"/>
+              <w:right w:type="dxa" w:w="110"/>
+            </w:tcMar>
+          </w:tcPr>
+          <w:p>
+            <w:r>
+              <w:rPr>
+                <w:rFonts w:ascii="Calibri" w:cs="Calibri" w:eastAsia="Calibri" w:hAnsi="Calibri"/>
+                <w:b/>
+                <w:bCs/>
+                <w:sz w:val="19"/>
+                <w:szCs w:val="19"/>
+              </w:rPr>
+              <w:t xml:space="preserve">Now</w:t>
+            </w:r>
+          </w:p>
+        </w:tc>
+        <w:tc>
+          <w:tcPr>
+            <w:tcW w:type="dxa" w:w="2100"/>
+            <w:tcBorders>
+              <w:top w:val="single" w:color="D1D5DB" w:sz="4"/>
+              <w:left w:val="single" w:color="D1D5DB" w:sz="4"/>
+              <w:bottom w:val="single" w:color="D1D5DB" w:sz="4"/>
+              <w:right w:val="single" w:color="D1D5DB" w:sz="4"/>
+            </w:tcBorders>
+            <w:shd w:fill="E5E7EB" w:color="auto" w:val="clear"/>
+            <w:tcMar>
+              <w:top w:type="dxa" w:w="70"/>
+              <w:left w:type="dxa" w:w="110"/>
+              <w:bottom w:type="dxa" w:w="70"/>
+              <w:right w:type="dxa" w:w="110"/>
+            </w:tcMar>
+          </w:tcPr>
+          <w:p>
+            <w:r>
+              <w:rPr>
+                <w:rFonts w:ascii="Calibri" w:cs="Calibri" w:eastAsia="Calibri" w:hAnsi="Calibri"/>
+                <w:b/>
+                <w:bCs/>
+                <w:sz w:val="19"/>
+                <w:szCs w:val="19"/>
+              </w:rPr>
+              <w:t xml:space="preserve">Change</w:t>
+            </w:r>
+          </w:p>
+        </w:tc>
+      </w:tr>
+      <w:tr>
+        <w:trPr>
+          <w:cantSplit/>
+        </w:trPr>
+        <w:tc>
+          <w:tcPr>
+            <w:tcW w:type="dxa" w:w="3600"/>
+            <w:tcBorders>
+              <w:top w:val="single" w:color="D1D5DB" w:sz="4"/>
+              <w:left w:val="single" w:color="D1D5DB" w:sz="4"/>
+              <w:bottom w:val="single" w:color="D1D5DB" w:sz="4"/>
+              <w:right w:val="single" w:color="D1D5DB" w:sz="4"/>
+            </w:tcBorders>
+            <w:tcMar>
+              <w:top w:type="dxa" w:w="70"/>
+              <w:left w:type="dxa" w:w="110"/>
+              <w:bottom w:type="dxa" w:w="70"/>
+              <w:right w:type="dxa" w:w="110"/>
+            </w:tcMar>
+          </w:tcPr>
+          <w:p>
+            <w:r>
+              <w:rPr>
+                <w:rFonts w:ascii="Calibri" w:cs="Calibri" w:eastAsia="Calibri" w:hAnsi="Calibri"/>
+                <w:sz w:val="19"/>
+                <w:szCs w:val="19"/>
+              </w:rPr>
+              <w:t xml:space="preserve">Server render, warm (16 fetches)</w:t>
+            </w:r>
+          </w:p>
+        </w:tc>
+        <w:tc>
+          <w:tcPr>
+            <w:tcW w:type="dxa" w:w="2100"/>
+            <w:tcBorders>
+              <w:top w:val="single" w:color="D1D5DB" w:sz="4"/>
+              <w:left w:val="single" w:color="D1D5DB" w:sz="4"/>
+              <w:bottom w:val="single" w:color="D1D5DB" w:sz="4"/>
+              <w:right w:val="single" w:color="D1D5DB" w:sz="4"/>
+            </w:tcBorders>
+            <w:tcMar>
+              <w:top w:type="dxa" w:w="70"/>
+              <w:left w:type="dxa" w:w="110"/>
+              <w:bottom w:type="dxa" w:w="70"/>
+              <w:right w:type="dxa" w:w="110"/>
+            </w:tcMar>
+          </w:tcPr>
+          <w:p>
+            <w:r>
+              <w:rPr>
+                <w:rFonts w:ascii="Calibri" w:cs="Calibri" w:eastAsia="Calibri" w:hAnsi="Calibri"/>
+                <w:sz w:val="19"/>
+                <w:szCs w:val="19"/>
+              </w:rPr>
+              <w:t xml:space="preserve">median 871 ms (5 fetches)</w:t>
+            </w:r>
+          </w:p>
+        </w:tc>
+        <w:tc>
+          <w:tcPr>
+            <w:tcW w:type="dxa" w:w="2100"/>
+            <w:tcBorders>
+              <w:top w:val="single" w:color="D1D5DB" w:sz="4"/>
+              <w:left w:val="single" w:color="D1D5DB" w:sz="4"/>
+              <w:bottom w:val="single" w:color="D1D5DB" w:sz="4"/>
+              <w:right w:val="single" w:color="D1D5DB" w:sz="4"/>
+            </w:tcBorders>
+            <w:tcMar>
+              <w:top w:type="dxa" w:w="70"/>
+              <w:left w:type="dxa" w:w="110"/>
+              <w:bottom w:type="dxa" w:w="70"/>
+              <w:right w:type="dxa" w:w="110"/>
+            </w:tcMar>
+          </w:tcPr>
+          <w:p>
+            <w:r>
+              <w:rPr>
+                <w:rFonts w:ascii="Calibri" w:cs="Calibri" w:eastAsia="Calibri" w:hAnsi="Calibri"/>
+                <w:sz w:val="19"/>
+                <w:szCs w:val="19"/>
+              </w:rPr>
+              <w:t xml:space="preserve">median 889 ms, range 749-1697</w:t>
+            </w:r>
+          </w:p>
+        </w:tc>
+        <w:tc>
+          <w:tcPr>
+            <w:tcW w:type="dxa" w:w="2100"/>
+            <w:tcBorders>
+              <w:top w:val="single" w:color="D1D5DB" w:sz="4"/>
+              <w:left w:val="single" w:color="D1D5DB" w:sz="4"/>
+              <w:bottom w:val="single" w:color="D1D5DB" w:sz="4"/>
+              <w:right w:val="single" w:color="D1D5DB" w:sz="4"/>
+            </w:tcBorders>
+            <w:tcMar>
+              <w:top w:type="dxa" w:w="70"/>
+              <w:left w:type="dxa" w:w="110"/>
+              <w:bottom w:type="dxa" w:w="70"/>
+              <w:right w:type="dxa" w:w="110"/>
+            </w:tcMar>
+          </w:tcPr>
+          <w:p>
+            <w:r>
+              <w:rPr>
+                <w:rFonts w:ascii="Calibri" w:cs="Calibri" w:eastAsia="Calibri" w:hAnsi="Calibri"/>
+                <w:b/>
+                <w:bCs/>
+                <w:color w:val="B45309"/>
+                <w:sz w:val="19"/>
+                <w:szCs w:val="19"/>
+              </w:rPr>
+              <w:t xml:space="preserve">no measurable change</w:t>
+            </w:r>
+          </w:p>
+        </w:tc>
+      </w:tr>
+      <w:tr>
+        <w:trPr>
+          <w:cantSplit/>
+        </w:trPr>
+        <w:tc>
+          <w:tcPr>
+            <w:tcW w:type="dxa" w:w="3600"/>
+            <w:tcBorders>
+              <w:top w:val="single" w:color="D1D5DB" w:sz="4"/>
+              <w:left w:val="single" w:color="D1D5DB" w:sz="4"/>
+              <w:bottom w:val="single" w:color="D1D5DB" w:sz="4"/>
+              <w:right w:val="single" w:color="D1D5DB" w:sz="4"/>
+            </w:tcBorders>
+            <w:tcMar>
+              <w:top w:type="dxa" w:w="70"/>
+              <w:left w:type="dxa" w:w="110"/>
+              <w:bottom w:type="dxa" w:w="70"/>
+              <w:right w:type="dxa" w:w="110"/>
+            </w:tcMar>
+          </w:tcPr>
+          <w:p>
+            <w:r>
+              <w:rPr>
+                <w:rFonts w:ascii="Calibri" w:cs="Calibri" w:eastAsia="Calibri" w:hAnsi="Calibri"/>
+                <w:sz w:val="19"/>
+                <w:szCs w:val="19"/>
+              </w:rPr>
+              <w:t xml:space="preserve">Hard page load, ready (3 loads)</w:t>
+            </w:r>
+          </w:p>
+        </w:tc>
+        <w:tc>
+          <w:tcPr>
+            <w:tcW w:type="dxa" w:w="2100"/>
+            <w:tcBorders>
+              <w:top w:val="single" w:color="D1D5DB" w:sz="4"/>
+              <w:left w:val="single" w:color="D1D5DB" w:sz="4"/>
+              <w:bottom w:val="single" w:color="D1D5DB" w:sz="4"/>
+              <w:right w:val="single" w:color="D1D5DB" w:sz="4"/>
+            </w:tcBorders>
+            <w:tcMar>
+              <w:top w:type="dxa" w:w="70"/>
+              <w:left w:type="dxa" w:w="110"/>
+              <w:bottom w:type="dxa" w:w="70"/>
+              <w:right w:type="dxa" w:w="110"/>
+            </w:tcMar>
+          </w:tcPr>
+          <w:p>
+            <w:r>
+              <w:rPr>
+                <w:rFonts w:ascii="Calibri" w:cs="Calibri" w:eastAsia="Calibri" w:hAnsi="Calibri"/>
+                <w:sz w:val="19"/>
+                <w:szCs w:val="19"/>
+              </w:rPr>
+              <w:t xml:space="preserve">1117-1994 ms</w:t>
+            </w:r>
+          </w:p>
+        </w:tc>
+        <w:tc>
+          <w:tcPr>
+            <w:tcW w:type="dxa" w:w="2100"/>
+            <w:tcBorders>
+              <w:top w:val="single" w:color="D1D5DB" w:sz="4"/>
+              <w:left w:val="single" w:color="D1D5DB" w:sz="4"/>
+              <w:bottom w:val="single" w:color="D1D5DB" w:sz="4"/>
+              <w:right w:val="single" w:color="D1D5DB" w:sz="4"/>
+            </w:tcBorders>
+            <w:tcMar>
+              <w:top w:type="dxa" w:w="70"/>
+              <w:left w:type="dxa" w:w="110"/>
+              <w:bottom w:type="dxa" w:w="70"/>
+              <w:right w:type="dxa" w:w="110"/>
+            </w:tcMar>
+          </w:tcPr>
+          <w:p>
+            <w:r>
+              <w:rPr>
+                <w:rFonts w:ascii="Calibri" w:cs="Calibri" w:eastAsia="Calibri" w:hAnsi="Calibri"/>
+                <w:sz w:val="19"/>
+                <w:szCs w:val="19"/>
+              </w:rPr>
+              <w:t xml:space="preserve">1062-1215 ms</w:t>
+            </w:r>
+          </w:p>
+        </w:tc>
+        <w:tc>
+          <w:tcPr>
+            <w:tcW w:type="dxa" w:w="2100"/>
+            <w:tcBorders>
+              <w:top w:val="single" w:color="D1D5DB" w:sz="4"/>
+              <w:left w:val="single" w:color="D1D5DB" w:sz="4"/>
+              <w:bottom w:val="single" w:color="D1D5DB" w:sz="4"/>
+              <w:right w:val="single" w:color="D1D5DB" w:sz="4"/>
+            </w:tcBorders>
+            <w:tcMar>
+              <w:top w:type="dxa" w:w="70"/>
+              <w:left w:type="dxa" w:w="110"/>
+              <w:bottom w:type="dxa" w:w="70"/>
+              <w:right w:type="dxa" w:w="110"/>
+            </w:tcMar>
+          </w:tcPr>
+          <w:p>
+            <w:r>
+              <w:rPr>
+                <w:rFonts w:ascii="Calibri" w:cs="Calibri" w:eastAsia="Calibri" w:hAnsi="Calibri"/>
+                <w:sz w:val="19"/>
+                <w:szCs w:val="19"/>
+              </w:rPr>
+              <w:t xml:space="preserve">inconclusive</w:t>
+            </w:r>
+          </w:p>
+        </w:tc>
+      </w:tr>
+      <w:tr>
+        <w:trPr>
+          <w:cantSplit/>
+        </w:trPr>
+        <w:tc>
+          <w:tcPr>
+            <w:tcW w:type="dxa" w:w="3600"/>
+            <w:tcBorders>
+              <w:top w:val="single" w:color="D1D5DB" w:sz="4"/>
+              <w:left w:val="single" w:color="D1D5DB" w:sz="4"/>
+              <w:bottom w:val="single" w:color="D1D5DB" w:sz="4"/>
+              <w:right w:val="single" w:color="D1D5DB" w:sz="4"/>
+            </w:tcBorders>
+            <w:tcMar>
+              <w:top w:type="dxa" w:w="70"/>
+              <w:left w:type="dxa" w:w="110"/>
+              <w:bottom w:type="dxa" w:w="70"/>
+              <w:right w:type="dxa" w:w="110"/>
+            </w:tcMar>
+          </w:tcPr>
+          <w:p>
+            <w:r>
+              <w:rPr>
+                <w:rFonts w:ascii="Calibri" w:cs="Calibri" w:eastAsia="Calibri" w:hAnsi="Calibri"/>
+                <w:sz w:val="19"/>
+                <w:szCs w:val="19"/>
+              </w:rPr>
+              <w:t xml:space="preserve">Refresh data</w:t>
+            </w:r>
+          </w:p>
+        </w:tc>
+        <w:tc>
+          <w:tcPr>
+            <w:tcW w:type="dxa" w:w="2100"/>
+            <w:tcBorders>
+              <w:top w:val="single" w:color="D1D5DB" w:sz="4"/>
+              <w:left w:val="single" w:color="D1D5DB" w:sz="4"/>
+              <w:bottom w:val="single" w:color="D1D5DB" w:sz="4"/>
+              <w:right w:val="single" w:color="D1D5DB" w:sz="4"/>
+            </w:tcBorders>
+            <w:tcMar>
+              <w:top w:type="dxa" w:w="70"/>
+              <w:left w:type="dxa" w:w="110"/>
+              <w:bottom w:type="dxa" w:w="70"/>
+              <w:right w:type="dxa" w:w="110"/>
+            </w:tcMar>
+          </w:tcPr>
+          <w:p>
+            <w:r>
+              <w:rPr>
+                <w:rFonts w:ascii="Calibri" w:cs="Calibri" w:eastAsia="Calibri" w:hAnsi="Calibri"/>
+                <w:sz w:val="19"/>
+                <w:szCs w:val="19"/>
+              </w:rPr>
+              <w:t xml:space="preserve">1257 ms</w:t>
+            </w:r>
+          </w:p>
+        </w:tc>
+        <w:tc>
+          <w:tcPr>
+            <w:tcW w:type="dxa" w:w="2100"/>
+            <w:tcBorders>
+              <w:top w:val="single" w:color="D1D5DB" w:sz="4"/>
+              <w:left w:val="single" w:color="D1D5DB" w:sz="4"/>
+              <w:bottom w:val="single" w:color="D1D5DB" w:sz="4"/>
+              <w:right w:val="single" w:color="D1D5DB" w:sz="4"/>
+            </w:tcBorders>
+            <w:tcMar>
+              <w:top w:type="dxa" w:w="70"/>
+              <w:left w:type="dxa" w:w="110"/>
+              <w:bottom w:type="dxa" w:w="70"/>
+              <w:right w:type="dxa" w:w="110"/>
+            </w:tcMar>
+          </w:tcPr>
+          <w:p>
+            <w:r>
+              <w:rPr>
+                <w:rFonts w:ascii="Calibri" w:cs="Calibri" w:eastAsia="Calibri" w:hAnsi="Calibri"/>
+                <w:sz w:val="19"/>
+                <w:szCs w:val="19"/>
+              </w:rPr>
+              <w:t xml:space="preserve">1439 ms</w:t>
+            </w:r>
+          </w:p>
+        </w:tc>
+        <w:tc>
+          <w:tcPr>
+            <w:tcW w:type="dxa" w:w="2100"/>
+            <w:tcBorders>
+              <w:top w:val="single" w:color="D1D5DB" w:sz="4"/>
+              <w:left w:val="single" w:color="D1D5DB" w:sz="4"/>
+              <w:bottom w:val="single" w:color="D1D5DB" w:sz="4"/>
+              <w:right w:val="single" w:color="D1D5DB" w:sz="4"/>
+            </w:tcBorders>
+            <w:tcMar>
+              <w:top w:type="dxa" w:w="70"/>
+              <w:left w:type="dxa" w:w="110"/>
+              <w:bottom w:type="dxa" w:w="70"/>
+              <w:right w:type="dxa" w:w="110"/>
+            </w:tcMar>
+          </w:tcPr>
+          <w:p>
+            <w:r>
+              <w:rPr>
+                <w:rFonts w:ascii="Calibri" w:cs="Calibri" w:eastAsia="Calibri" w:hAnsi="Calibri"/>
+                <w:sz w:val="19"/>
+                <w:szCs w:val="19"/>
+              </w:rPr>
+              <w:t xml:space="preserve">within noise</w:t>
+            </w:r>
+          </w:p>
+        </w:tc>
+      </w:tr>
+      <w:tr>
+        <w:trPr>
+          <w:cantSplit/>
+        </w:trPr>
+        <w:tc>
+          <w:tcPr>
+            <w:tcW w:type="dxa" w:w="3600"/>
+            <w:tcBorders>
+              <w:top w:val="single" w:color="D1D5DB" w:sz="4"/>
+              <w:left w:val="single" w:color="D1D5DB" w:sz="4"/>
+              <w:bottom w:val="single" w:color="D1D5DB" w:sz="4"/>
+              <w:right w:val="single" w:color="D1D5DB" w:sz="4"/>
+            </w:tcBorders>
+            <w:tcMar>
+              <w:top w:type="dxa" w:w="70"/>
+              <w:left w:type="dxa" w:w="110"/>
+              <w:bottom w:type="dxa" w:w="70"/>
+              <w:right w:type="dxa" w:w="110"/>
+            </w:tcMar>
+          </w:tcPr>
+          <w:p>
+            <w:r>
+              <w:rPr>
+                <w:rFonts w:ascii="Calibri" w:cs="Calibri" w:eastAsia="Calibri" w:hAnsi="Calibri"/>
+                <w:sz w:val="19"/>
+                <w:szCs w:val="19"/>
+              </w:rPr>
+              <w:t xml:space="preserve">Tab click, UI changed (8 clicks)</w:t>
+            </w:r>
+          </w:p>
+        </w:tc>
+        <w:tc>
+          <w:tcPr>
+            <w:tcW w:type="dxa" w:w="2100"/>
+            <w:tcBorders>
+              <w:top w:val="single" w:color="D1D5DB" w:sz="4"/>
+              <w:left w:val="single" w:color="D1D5DB" w:sz="4"/>
+              <w:bottom w:val="single" w:color="D1D5DB" w:sz="4"/>
+              <w:right w:val="single" w:color="D1D5DB" w:sz="4"/>
+            </w:tcBorders>
+            <w:tcMar>
+              <w:top w:type="dxa" w:w="70"/>
+              <w:left w:type="dxa" w:w="110"/>
+              <w:bottom w:type="dxa" w:w="70"/>
+              <w:right w:type="dxa" w:w="110"/>
+            </w:tcMar>
+          </w:tcPr>
+          <w:p>
+            <w:r>
+              <w:rPr>
+                <w:rFonts w:ascii="Calibri" w:cs="Calibri" w:eastAsia="Calibri" w:hAnsi="Calibri"/>
+                <w:sz w:val="19"/>
+                <w:szCs w:val="19"/>
+              </w:rPr>
+              <w:t xml:space="preserve">median 17 ms</w:t>
+            </w:r>
+          </w:p>
+        </w:tc>
+        <w:tc>
+          <w:tcPr>
+            <w:tcW w:type="dxa" w:w="2100"/>
+            <w:tcBorders>
+              <w:top w:val="single" w:color="D1D5DB" w:sz="4"/>
+              <w:left w:val="single" w:color="D1D5DB" w:sz="4"/>
+              <w:bottom w:val="single" w:color="D1D5DB" w:sz="4"/>
+              <w:right w:val="single" w:color="D1D5DB" w:sz="4"/>
+            </w:tcBorders>
+            <w:tcMar>
+              <w:top w:type="dxa" w:w="70"/>
+              <w:left w:type="dxa" w:w="110"/>
+              <w:bottom w:type="dxa" w:w="70"/>
+              <w:right w:type="dxa" w:w="110"/>
+            </w:tcMar>
+          </w:tcPr>
+          <w:p>
+            <w:r>
+              <w:rPr>
+                <w:rFonts w:ascii="Calibri" w:cs="Calibri" w:eastAsia="Calibri" w:hAnsi="Calibri"/>
+                <w:sz w:val="19"/>
+                <w:szCs w:val="19"/>
+              </w:rPr>
+              <w:t xml:space="preserve">median 16 ms, 0 data requests</w:t>
+            </w:r>
+          </w:p>
+        </w:tc>
+        <w:tc>
+          <w:tcPr>
+            <w:tcW w:type="dxa" w:w="2100"/>
+            <w:tcBorders>
+              <w:top w:val="single" w:color="D1D5DB" w:sz="4"/>
+              <w:left w:val="single" w:color="D1D5DB" w:sz="4"/>
+              <w:bottom w:val="single" w:color="D1D5DB" w:sz="4"/>
+              <w:right w:val="single" w:color="D1D5DB" w:sz="4"/>
+            </w:tcBorders>
+            <w:tcMar>
+              <w:top w:type="dxa" w:w="70"/>
+              <w:left w:type="dxa" w:w="110"/>
+              <w:bottom w:type="dxa" w:w="70"/>
+              <w:right w:type="dxa" w:w="110"/>
+            </w:tcMar>
+          </w:tcPr>
+          <w:p>
+            <w:r>
+              <w:rPr>
+                <w:rFonts w:ascii="Calibri" w:cs="Calibri" w:eastAsia="Calibri" w:hAnsi="Calibri"/>
+                <w:sz w:val="19"/>
+                <w:szCs w:val="19"/>
+              </w:rPr>
+              <w:t xml:space="preserve">unchanged</w:t>
+            </w:r>
+          </w:p>
+        </w:tc>
+      </w:tr>
+      <w:tr>
+        <w:trPr>
+          <w:cantSplit/>
+        </w:trPr>
+        <w:tc>
+          <w:tcPr>
+            <w:tcW w:type="dxa" w:w="3600"/>
+            <w:tcBorders>
+              <w:top w:val="single" w:color="D1D5DB" w:sz="4"/>
+              <w:left w:val="single" w:color="D1D5DB" w:sz="4"/>
+              <w:bottom w:val="single" w:color="D1D5DB" w:sz="4"/>
+              <w:right w:val="single" w:color="D1D5DB" w:sz="4"/>
+            </w:tcBorders>
+            <w:tcMar>
+              <w:top w:type="dxa" w:w="70"/>
+              <w:left w:type="dxa" w:w="110"/>
+              <w:bottom w:type="dxa" w:w="70"/>
+              <w:right w:type="dxa" w:w="110"/>
+            </w:tcMar>
+          </w:tcPr>
+          <w:p>
+            <w:r>
+              <w:rPr>
+                <w:rFonts w:ascii="Calibri" w:cs="Calibri" w:eastAsia="Calibri" w:hAnsi="Calibri"/>
+                <w:sz w:val="19"/>
+                <w:szCs w:val="19"/>
+              </w:rPr>
+              <w:t xml:space="preserve">30-click burst</w:t>
+            </w:r>
+          </w:p>
+        </w:tc>
+        <w:tc>
+          <w:tcPr>
+            <w:tcW w:type="dxa" w:w="2100"/>
+            <w:tcBorders>
+              <w:top w:val="single" w:color="D1D5DB" w:sz="4"/>
+              <w:left w:val="single" w:color="D1D5DB" w:sz="4"/>
+              <w:bottom w:val="single" w:color="D1D5DB" w:sz="4"/>
+              <w:right w:val="single" w:color="D1D5DB" w:sz="4"/>
+            </w:tcBorders>
+            <w:tcMar>
+              <w:top w:type="dxa" w:w="70"/>
+              <w:left w:type="dxa" w:w="110"/>
+              <w:bottom w:type="dxa" w:w="70"/>
+              <w:right w:type="dxa" w:w="110"/>
+            </w:tcMar>
+          </w:tcPr>
+          <w:p>
+            <w:r>
+              <w:rPr>
+                <w:rFonts w:ascii="Calibri" w:cs="Calibri" w:eastAsia="Calibri" w:hAnsi="Calibri"/>
+                <w:sz w:val="19"/>
+                <w:szCs w:val="19"/>
+              </w:rPr>
+              <w:t xml:space="preserve">0 requests, 16 of 16</w:t>
+            </w:r>
+          </w:p>
+        </w:tc>
+        <w:tc>
+          <w:tcPr>
+            <w:tcW w:type="dxa" w:w="2100"/>
+            <w:tcBorders>
+              <w:top w:val="single" w:color="D1D5DB" w:sz="4"/>
+              <w:left w:val="single" w:color="D1D5DB" w:sz="4"/>
+              <w:bottom w:val="single" w:color="D1D5DB" w:sz="4"/>
+              <w:right w:val="single" w:color="D1D5DB" w:sz="4"/>
+            </w:tcBorders>
+            <w:tcMar>
+              <w:top w:type="dxa" w:w="70"/>
+              <w:left w:type="dxa" w:w="110"/>
+              <w:bottom w:type="dxa" w:w="70"/>
+              <w:right w:type="dxa" w:w="110"/>
+            </w:tcMar>
+          </w:tcPr>
+          <w:p>
+            <w:r>
+              <w:rPr>
+                <w:rFonts w:ascii="Calibri" w:cs="Calibri" w:eastAsia="Calibri" w:hAnsi="Calibri"/>
+                <w:sz w:val="19"/>
+                <w:szCs w:val="19"/>
+              </w:rPr>
+              <w:t xml:space="preserve">0 requests, 16 of 16, 0 Unknown</w:t>
+            </w:r>
+          </w:p>
+        </w:tc>
+        <w:tc>
+          <w:tcPr>
+            <w:tcW w:type="dxa" w:w="2100"/>
+            <w:tcBorders>
+              <w:top w:val="single" w:color="D1D5DB" w:sz="4"/>
+              <w:left w:val="single" w:color="D1D5DB" w:sz="4"/>
+              <w:bottom w:val="single" w:color="D1D5DB" w:sz="4"/>
+              <w:right w:val="single" w:color="D1D5DB" w:sz="4"/>
+            </w:tcBorders>
+            <w:tcMar>
+              <w:top w:type="dxa" w:w="70"/>
+              <w:left w:type="dxa" w:w="110"/>
+              <w:bottom w:type="dxa" w:w="70"/>
+              <w:right w:type="dxa" w:w="110"/>
+            </w:tcMar>
+          </w:tcPr>
+          <w:p>
+            <w:r>
+              <w:rPr>
+                <w:rFonts w:ascii="Calibri" w:cs="Calibri" w:eastAsia="Calibri" w:hAnsi="Calibri"/>
+                <w:sz w:val="19"/>
+                <w:szCs w:val="19"/>
+              </w:rPr>
+              <w:t xml:space="preserve">unchanged</w:t>
+            </w:r>
+          </w:p>
+        </w:tc>
+      </w:tr>
+    </w:tbl>
+    <w:p>
+      <w:pPr>
+        <w:spacing w:after="100"/>
+      </w:pPr>
+    </w:p>
+    <w:tbl>
+      <w:tblPr>
+        <w:tblW w:type="dxa" w:w="9900"/>
+        <w:tblBorders>
+          <w:top w:val="single" w:color="auto" w:sz="4"/>
+          <w:left w:val="single" w:color="auto" w:sz="4"/>
+          <w:bottom w:val="single" w:color="auto" w:sz="4"/>
+          <w:right w:val="single" w:color="auto" w:sz="4"/>
+          <w:insideH w:val="single" w:color="auto" w:sz="4"/>
+          <w:insideV w:val="single" w:color="auto" w:sz="4"/>
+        </w:tblBorders>
+      </w:tblPr>
+      <w:tblGrid>
+        <w:gridCol w:w="9900"/>
+      </w:tblGrid>
+      <w:tr>
+        <w:tc>
+          <w:tcPr>
+            <w:tcW w:type="dxa" w:w="9900"/>
+            <w:tcBorders>
+              <w:top w:val="single" w:color="D1D5DB" w:sz="4"/>
+              <w:left w:val="single" w:color="B45309" w:sz="24"/>
+              <w:bottom w:val="single" w:color="D1D5DB" w:sz="4"/>
+              <w:right w:val="single" w:color="D1D5DB" w:sz="4"/>
+            </w:tcBorders>
+            <w:shd w:fill="FFFBEB" w:color="auto" w:val="clear"/>
+            <w:tcMar>
+              <w:top w:type="dxa" w:w="100"/>
+              <w:left w:type="dxa" w:w="180"/>
+              <w:bottom w:type="dxa" w:w="100"/>
+              <w:right w:type="dxa" w:w="160"/>
+            </w:tcMar>
+          </w:tcPr>
+          <w:p>
+            <w:pPr>
+              <w:spacing w:after="50"/>
+            </w:pPr>
+            <w:r>
+              <w:rPr>
+                <w:rFonts w:ascii="Calibri" w:cs="Calibri" w:eastAsia="Calibri" w:hAnsi="Calibri"/>
+                <w:b/>
+                <w:bCs/>
+                <w:color w:val="B45309"/>
+                <w:sz w:val="21"/>
+                <w:szCs w:val="21"/>
+              </w:rPr>
+              <w:t xml:space="preserve">Honest reading</w:t>
+            </w:r>
+          </w:p>
+          <w:p>
+            <w:pPr>
+              <w:spacing w:after="40"/>
+            </w:pPr>
+            <w:r>
+              <w:rPr>
+                <w:rFonts w:ascii="Calibri" w:cs="Calibri" w:eastAsia="Calibri" w:hAnsi="Calibri"/>
+                <w:color w:val="1F2937"/>
+                <w:sz w:val="20"/>
+                <w:szCs w:val="20"/>
+              </w:rPr>
+              <w:t xml:space="preserve">The change works as designed and the page is correct, but it did not make production measurably faster. The likeliest reason is that the production session check is short, so little was left to overlap; the local proxy made it as slow as the data request, which exaggerated the gain.</w:t>
+            </w:r>
+          </w:p>
+          <w:p>
+            <w:pPr>
+              <w:spacing w:after="40"/>
+            </w:pPr>
+            <w:r>
+              <w:rPr>
+                <w:rFonts w:ascii="Calibri" w:cs="Calibri" w:eastAsia="Calibri" w:hAnsi="Calibri"/>
+                <w:color w:val="1F2937"/>
+                <w:sz w:val="20"/>
+                <w:szCs w:val="20"/>
+              </w:rPr>
+              <w:t xml:space="preserve">The remaining 0.8-0.9 s of server render is probably inside the backend request (database round trips, building a 274 KB response). That cannot be seen from the browser: the Server-Timing header and the load log line are in the hosting provider's logs, and have not been read yet. The sign-in and invalid-key redirects were not tested on production, because that would mean signing the account out or altering its cookie.</w:t>
+            </w:r>
+          </w:p>
+        </w:tc>
+      </w:tr>
+    </w:tbl>
+    <w:p>
+      <w:pPr>
+        <w:pStyle w:val="Heading1"/>
+        <w:spacing w:after="140" w:before="320"/>
+      </w:pPr>
+      <w:r>
+        <w:rPr>
+          <w:rFonts w:ascii="Calibri" w:cs="Calibri" w:eastAsia="Calibri" w:hAnsi="Calibri"/>
+          <w:b/>
+          <w:bCs/>
+          <w:color w:val="1F2937"/>
+          <w:sz w:val="32"/>
+          <w:szCs w:val="32"/>
+        </w:rPr>
+        <w:t xml:space="preserve">9. Limits and what is not done</w:t>
       </w:r>
     </w:p>
     <w:p>
@@ -8411,7 +9802,7 @@
           <w:sz w:val="21"/>
           <w:szCs w:val="21"/>
         </w:rPr>
-        <w:t xml:space="preserve">The second change made it so: the page makes one workspace request instead of 18 calls, in two hops instead of three, and the server render fell from 2.0 s to 0.87 s. What remains is the session check ahead of it. Inside the backend, the workspace route still runs a few database queries per run, so its work grows with the number of runs, but in one request rather than one request per call.</w:t>
+        <w:t xml:space="preserve">The second change made it so: the page makes one workspace request instead of 18 calls, and the server render fell from 2.0 s to 0.87 s. The third change took the session check out of the way locally but did not move production, so the remaining time is most likely inside the backend request. Inside it, the workspace route still runs a few database queries per run, so its work grows with the number of runs, but in one request rather than one request per call.</w:t>
       </w:r>
     </w:p>
     <w:p>
@@ -8564,7 +9955,7 @@
           <w:sz w:val="32"/>
           <w:szCs w:val="32"/>
         </w:rPr>
-        <w:t xml:space="preserve">9. Success criteria and result</w:t>
+        <w:t xml:space="preserve">10. Success criteria and result</w:t>
       </w:r>
     </w:p>
     <w:p>
@@ -9077,7 +10468,7 @@
           <w:sz w:val="21"/>
           <w:szCs w:val="21"/>
         </w:rPr>
-        <w:t xml:space="preserve">run the session check and the workspace request together, which would remove the last extra round; read the Server-Timing log line to see where the remaining time goes; and optionally remove the duplicate source text from the manifests. None is started.</w:t>
+        <w:t xml:space="preserve">read the Server-Timing log line from the hosting provider to see where the remaining 0.85 s goes (that decides whether the backend queries are worth restructuring); and optionally remove the duplicate source text from the manifests. Neither is started.</w:t>
       </w:r>
     </w:p>
     <w:sectPr>

</xml_diff>